<commit_message>
july drafts and conversion
</commit_message>
<xml_diff>
--- a/drafts/vu/2025-07-u/03-ЧТ-Якинта.docx
+++ b/drafts/vu/2025-07-u/03-ЧТ-Якинта.docx
@@ -855,7 +855,7 @@
           <w:color w:val="FF0000"/>
           <w:sz w:val="24"/>
         </w:rPr>
-        <w:t>Під час 103-го псалма священник мовить перед св. дверми вечірні молитви:</w:t>
+        <w:t xml:space="preserve">Під час 103-го псалма Священник мовить перед св. дверми вечірні молитви. </w:t>
       </w:r>
     </w:p>
     <w:p>
@@ -1624,7 +1624,15 @@
           <w:sz w:val="24"/>
           <w:u w:val="single"/>
         </w:rPr>
-        <w:t>[Господи щедрий і милосердний, довготерпеливий і многомилостивий! Вислухай молитви наші і зверни увагу на голос моління нашого і яви нам знак милости Твоєї, наведи нас на дорогу Твою, щоб ходили ми в Твоїй правді. Звесели серця наші, щоб ми боялись імення Твого святого, бо Ти великий і твориш чуда; Ти Бог єдиний і немає подібного Тобі між богами, Господи. Ти сильний у милості і добрий у силі, аби допомагати й утішати, і спасати всіх, хто на ім'я Твоє святе уповає.]</w:t>
+        <w:t xml:space="preserve">[Господи щедрий і милосердний, довготерпеливий і многомилостивий! Вислухай молитви наші і зверни увагу на голос моління нашого і яви нам знак милости Твоєї, наведи нас на дорогу Твою, щоб ходили ми в Твоїй правді. Звесели серця наші, щоб ми боялись імення Твого святого, бо Ти великий і твориш чуда; Ти Бог єдиний і немає подібного Тобі між богами, </w:t>
+      </w:r>
+      <w:r>
+        <w:rPr>
+          <w:rFonts w:ascii="Times New Roman" w:hAnsi="Times New Roman"/>
+          <w:sz w:val="24"/>
+          <w:u w:val="single"/>
+        </w:rPr>
+        <w:t>Господи. Ти сильний у милості і добрий у силі, аби допомагати й утішати, і спасати всіх, хто на ім'я Твоє святе уповає.]</w:t>
       </w:r>
     </w:p>
     <w:p>
@@ -2818,24 +2826,113 @@
       <w:r>
         <w:rPr>
           <w:rFonts w:ascii="Times New Roman" w:hAnsi="Times New Roman"/>
-          <w:b w:val="0"/>
           <w:i/>
           <w:color w:val="FF0000"/>
           <w:sz w:val="24"/>
-          <w:u w:val="none"/>
-        </w:rPr>
-        <w:t xml:space="preserve">(г. 8, подібний: О преславне чудо): </w:t>
-      </w:r>
-      <w:r>
-        <w:rPr>
-          <w:rFonts w:ascii="Times New Roman" w:hAnsi="Times New Roman"/>
-          <w:b w:val="0"/>
-          <w:i w:val="0"/>
-          <w:color w:val="000000"/>
-          <w:sz w:val="24"/>
-          <w:u w:val="none"/>
-        </w:rPr>
-        <w:t>Ка́мінь покла́дено нарі́жний,</w:t>
+        </w:rPr>
+        <w:t xml:space="preserve">(г. 8, </w:t>
+      </w:r>
+      <w:r>
+        <w:rPr>
+          <w:rFonts w:ascii="Times New Roman" w:hAnsi="Times New Roman"/>
+          <w:i/>
+          <w:color w:val="FF0000"/>
+          <w:sz w:val="24"/>
+        </w:rPr>
+        <w:t>подібний</w:t>
+      </w:r>
+      <w:r>
+        <w:rPr>
+          <w:rFonts w:ascii="Times New Roman" w:hAnsi="Times New Roman"/>
+          <w:i/>
+          <w:color w:val="FF0000"/>
+          <w:sz w:val="24"/>
+        </w:rPr>
+        <w:t xml:space="preserve">: О </w:t>
+      </w:r>
+      <w:r>
+        <w:rPr>
+          <w:rFonts w:ascii="Times New Roman" w:hAnsi="Times New Roman"/>
+          <w:i/>
+          <w:color w:val="FF0000"/>
+          <w:sz w:val="24"/>
+        </w:rPr>
+        <w:t>преславне</w:t>
+      </w:r>
+      <w:r>
+        <w:rPr>
+          <w:rFonts w:ascii="Times New Roman" w:hAnsi="Times New Roman"/>
+          <w:i/>
+          <w:color w:val="FF0000"/>
+          <w:sz w:val="24"/>
+        </w:rPr>
+        <w:t xml:space="preserve"> </w:t>
+      </w:r>
+      <w:r>
+        <w:rPr>
+          <w:rFonts w:ascii="Times New Roman" w:hAnsi="Times New Roman"/>
+          <w:i/>
+          <w:color w:val="FF0000"/>
+          <w:sz w:val="24"/>
+        </w:rPr>
+        <w:t>чудо</w:t>
+      </w:r>
+      <w:r>
+        <w:rPr>
+          <w:rFonts w:ascii="Times New Roman" w:hAnsi="Times New Roman"/>
+          <w:i/>
+          <w:color w:val="FF0000"/>
+          <w:sz w:val="24"/>
+        </w:rPr>
+        <w:t xml:space="preserve">): </w:t>
+      </w:r>
+      <w:r>
+        <w:rPr>
+          <w:rFonts w:ascii="Times New Roman" w:hAnsi="Times New Roman"/>
+          <w:color w:val="000000"/>
+          <w:sz w:val="24"/>
+        </w:rPr>
+        <w:t>Ка́мінь</w:t>
+      </w:r>
+      <w:r>
+        <w:rPr>
+          <w:rFonts w:ascii="Times New Roman" w:hAnsi="Times New Roman"/>
+          <w:color w:val="000000"/>
+          <w:sz w:val="24"/>
+        </w:rPr>
+        <w:t xml:space="preserve"> </w:t>
+      </w:r>
+      <w:r>
+        <w:rPr>
+          <w:rFonts w:ascii="Times New Roman" w:hAnsi="Times New Roman"/>
+          <w:color w:val="000000"/>
+          <w:sz w:val="24"/>
+        </w:rPr>
+        <w:t>покла́дено</w:t>
+      </w:r>
+      <w:r>
+        <w:rPr>
+          <w:rFonts w:ascii="Times New Roman" w:hAnsi="Times New Roman"/>
+          <w:color w:val="000000"/>
+          <w:sz w:val="24"/>
+        </w:rPr>
+        <w:t xml:space="preserve"> </w:t>
+      </w:r>
+      <w:r>
+        <w:rPr>
+          <w:rFonts w:ascii="Times New Roman" w:hAnsi="Times New Roman"/>
+          <w:color w:val="000000"/>
+          <w:sz w:val="24"/>
+        </w:rPr>
+        <w:t>нарі́жний</w:t>
+      </w:r>
+      <w:r>
+        <w:rPr>
+          <w:rFonts w:ascii="Times New Roman" w:hAnsi="Times New Roman"/>
+          <w:color w:val="000000"/>
+          <w:sz w:val="24"/>
+        </w:rPr>
+        <w:t>,</w:t>
       </w:r>
       <w:r>
         <w:rPr>
@@ -2847,13 +2944,58 @@
       <w:r>
         <w:rPr>
           <w:rFonts w:ascii="Times New Roman" w:hAnsi="Times New Roman"/>
-          <w:b w:val="0"/>
-          <w:i w:val="0"/>
-          <w:color w:val="000000"/>
-          <w:sz w:val="24"/>
-          <w:u w:val="none"/>
-        </w:rPr>
-        <w:t xml:space="preserve"> о́браний на Сіо́ні,</w:t>
+          <w:color w:val="000000"/>
+          <w:sz w:val="24"/>
+        </w:rPr>
+        <w:t xml:space="preserve"> </w:t>
+      </w:r>
+      <w:r>
+        <w:rPr>
+          <w:rFonts w:ascii="Times New Roman" w:hAnsi="Times New Roman"/>
+          <w:color w:val="000000"/>
+          <w:sz w:val="24"/>
+        </w:rPr>
+        <w:t>о́браний</w:t>
+      </w:r>
+      <w:r>
+        <w:rPr>
+          <w:rFonts w:ascii="Times New Roman" w:hAnsi="Times New Roman"/>
+          <w:color w:val="000000"/>
+          <w:sz w:val="24"/>
+        </w:rPr>
+        <w:t xml:space="preserve"> </w:t>
+      </w:r>
+      <w:r>
+        <w:rPr>
+          <w:rFonts w:ascii="Times New Roman" w:hAnsi="Times New Roman"/>
+          <w:color w:val="000000"/>
+          <w:sz w:val="24"/>
+        </w:rPr>
+        <w:t>на</w:t>
+      </w:r>
+      <w:r>
+        <w:rPr>
+          <w:rFonts w:ascii="Times New Roman" w:hAnsi="Times New Roman"/>
+          <w:color w:val="000000"/>
+          <w:sz w:val="24"/>
+        </w:rPr>
+        <w:t xml:space="preserve"> </w:t>
+      </w:r>
+      <w:r>
+        <w:rPr>
+          <w:rFonts w:ascii="Times New Roman" w:hAnsi="Times New Roman"/>
+          <w:color w:val="000000"/>
+          <w:sz w:val="24"/>
+        </w:rPr>
+        <w:t>Сіо́ні</w:t>
+      </w:r>
+      <w:r>
+        <w:rPr>
+          <w:rFonts w:ascii="Times New Roman" w:hAnsi="Times New Roman"/>
+          <w:color w:val="000000"/>
+          <w:sz w:val="24"/>
+        </w:rPr>
+        <w:t>,</w:t>
       </w:r>
       <w:r>
         <w:rPr>
@@ -2865,13 +3007,42 @@
       <w:r>
         <w:rPr>
           <w:rFonts w:ascii="Times New Roman" w:hAnsi="Times New Roman"/>
-          <w:b w:val="0"/>
-          <w:i w:val="0"/>
-          <w:color w:val="000000"/>
-          <w:sz w:val="24"/>
-          <w:u w:val="none"/>
-        </w:rPr>
-        <w:t xml:space="preserve"> і непору́шну осно́ву,</w:t>
+          <w:color w:val="000000"/>
+          <w:sz w:val="24"/>
+        </w:rPr>
+        <w:t xml:space="preserve"> і </w:t>
+      </w:r>
+      <w:r>
+        <w:rPr>
+          <w:rFonts w:ascii="Times New Roman" w:hAnsi="Times New Roman"/>
+          <w:color w:val="000000"/>
+          <w:sz w:val="24"/>
+        </w:rPr>
+        <w:t>непору́шну</w:t>
+      </w:r>
+      <w:r>
+        <w:rPr>
+          <w:rFonts w:ascii="Times New Roman" w:hAnsi="Times New Roman"/>
+          <w:color w:val="000000"/>
+          <w:sz w:val="24"/>
+        </w:rPr>
+        <w:t xml:space="preserve"> </w:t>
+      </w:r>
+      <w:r>
+        <w:rPr>
+          <w:rFonts w:ascii="Times New Roman" w:hAnsi="Times New Roman"/>
+          <w:color w:val="000000"/>
+          <w:sz w:val="24"/>
+        </w:rPr>
+        <w:t>осно́ву</w:t>
+      </w:r>
+      <w:r>
+        <w:rPr>
+          <w:rFonts w:ascii="Times New Roman" w:hAnsi="Times New Roman"/>
+          <w:color w:val="000000"/>
+          <w:sz w:val="24"/>
+        </w:rPr>
+        <w:t>,</w:t>
       </w:r>
       <w:r>
         <w:rPr>
@@ -2883,13 +3054,90 @@
       <w:r>
         <w:rPr>
           <w:rFonts w:ascii="Times New Roman" w:hAnsi="Times New Roman"/>
-          <w:b w:val="0"/>
-          <w:i w:val="0"/>
-          <w:color w:val="000000"/>
-          <w:sz w:val="24"/>
-          <w:u w:val="none"/>
-        </w:rPr>
-        <w:t xml:space="preserve"> на які́й воздви́глися полки́ му́чеників;</w:t>
+          <w:color w:val="000000"/>
+          <w:sz w:val="24"/>
+        </w:rPr>
+        <w:t xml:space="preserve"> </w:t>
+      </w:r>
+      <w:r>
+        <w:rPr>
+          <w:rFonts w:ascii="Times New Roman" w:hAnsi="Times New Roman"/>
+          <w:color w:val="000000"/>
+          <w:sz w:val="24"/>
+        </w:rPr>
+        <w:t>на</w:t>
+      </w:r>
+      <w:r>
+        <w:rPr>
+          <w:rFonts w:ascii="Times New Roman" w:hAnsi="Times New Roman"/>
+          <w:color w:val="000000"/>
+          <w:sz w:val="24"/>
+        </w:rPr>
+        <w:t xml:space="preserve"> </w:t>
+      </w:r>
+      <w:r>
+        <w:rPr>
+          <w:rFonts w:ascii="Times New Roman" w:hAnsi="Times New Roman"/>
+          <w:color w:val="000000"/>
+          <w:sz w:val="24"/>
+        </w:rPr>
+        <w:t>які́й</w:t>
+      </w:r>
+      <w:r>
+        <w:rPr>
+          <w:rFonts w:ascii="Times New Roman" w:hAnsi="Times New Roman"/>
+          <w:color w:val="000000"/>
+          <w:sz w:val="24"/>
+        </w:rPr>
+        <w:t xml:space="preserve"> </w:t>
+      </w:r>
+      <w:r>
+        <w:rPr>
+          <w:rFonts w:ascii="Times New Roman" w:hAnsi="Times New Roman"/>
+          <w:color w:val="000000"/>
+          <w:sz w:val="24"/>
+        </w:rPr>
+        <w:t>воздви́глися</w:t>
+      </w:r>
+      <w:r>
+        <w:rPr>
+          <w:rFonts w:ascii="Times New Roman" w:hAnsi="Times New Roman"/>
+          <w:color w:val="000000"/>
+          <w:sz w:val="24"/>
+        </w:rPr>
+        <w:t xml:space="preserve"> </w:t>
+      </w:r>
+      <w:r>
+        <w:rPr>
+          <w:rFonts w:ascii="Times New Roman" w:hAnsi="Times New Roman"/>
+          <w:color w:val="000000"/>
+          <w:sz w:val="24"/>
+        </w:rPr>
+        <w:t>полки</w:t>
+      </w:r>
+      <w:r>
+        <w:rPr>
+          <w:rFonts w:ascii="Times New Roman" w:hAnsi="Times New Roman"/>
+          <w:color w:val="000000"/>
+          <w:sz w:val="24"/>
+        </w:rPr>
+        <w:t xml:space="preserve">́ </w:t>
+      </w:r>
+      <w:r>
+        <w:rPr>
+          <w:rFonts w:ascii="Times New Roman" w:hAnsi="Times New Roman"/>
+          <w:color w:val="000000"/>
+          <w:sz w:val="24"/>
+        </w:rPr>
+        <w:t>му́чеників</w:t>
+      </w:r>
+      <w:r>
+        <w:rPr>
+          <w:rFonts w:ascii="Times New Roman" w:hAnsi="Times New Roman"/>
+          <w:color w:val="000000"/>
+          <w:sz w:val="24"/>
+        </w:rPr>
+        <w:t>;</w:t>
       </w:r>
       <w:r>
         <w:rPr>
@@ -2901,13 +3149,66 @@
       <w:r>
         <w:rPr>
           <w:rFonts w:ascii="Times New Roman" w:hAnsi="Times New Roman"/>
-          <w:b w:val="0"/>
-          <w:i w:val="0"/>
-          <w:color w:val="000000"/>
-          <w:sz w:val="24"/>
-          <w:u w:val="none"/>
-        </w:rPr>
-        <w:t xml:space="preserve"> із ни́ми побідоно́сець Яки́нт</w:t>
+          <w:color w:val="000000"/>
+          <w:sz w:val="24"/>
+        </w:rPr>
+        <w:t xml:space="preserve"> </w:t>
+      </w:r>
+      <w:r>
+        <w:rPr>
+          <w:rFonts w:ascii="Times New Roman" w:hAnsi="Times New Roman"/>
+          <w:color w:val="000000"/>
+          <w:sz w:val="24"/>
+        </w:rPr>
+        <w:t>із</w:t>
+      </w:r>
+      <w:r>
+        <w:rPr>
+          <w:rFonts w:ascii="Times New Roman" w:hAnsi="Times New Roman"/>
+          <w:color w:val="000000"/>
+          <w:sz w:val="24"/>
+        </w:rPr>
+        <w:t xml:space="preserve"> </w:t>
+      </w:r>
+      <w:r>
+        <w:rPr>
+          <w:rFonts w:ascii="Times New Roman" w:hAnsi="Times New Roman"/>
+          <w:color w:val="000000"/>
+          <w:sz w:val="24"/>
+        </w:rPr>
+        <w:t>ни́ми</w:t>
+      </w:r>
+      <w:r>
+        <w:rPr>
+          <w:rFonts w:ascii="Times New Roman" w:hAnsi="Times New Roman"/>
+          <w:color w:val="000000"/>
+          <w:sz w:val="24"/>
+        </w:rPr>
+        <w:t xml:space="preserve"> </w:t>
+      </w:r>
+      <w:r>
+        <w:rPr>
+          <w:rFonts w:ascii="Times New Roman" w:hAnsi="Times New Roman"/>
+          <w:color w:val="000000"/>
+          <w:sz w:val="24"/>
+        </w:rPr>
+        <w:t>побідоно́сець</w:t>
+      </w:r>
+      <w:r>
+        <w:rPr>
+          <w:rFonts w:ascii="Times New Roman" w:hAnsi="Times New Roman"/>
+          <w:color w:val="000000"/>
+          <w:sz w:val="24"/>
+        </w:rPr>
+        <w:t xml:space="preserve"> </w:t>
+      </w:r>
+      <w:r>
+        <w:rPr>
+          <w:rFonts w:ascii="Times New Roman" w:hAnsi="Times New Roman"/>
+          <w:color w:val="000000"/>
+          <w:sz w:val="24"/>
+        </w:rPr>
+        <w:t>Яки́нт</w:t>
       </w:r>
       <w:r>
         <w:rPr>
@@ -2919,13 +3220,42 @@
       <w:r>
         <w:rPr>
           <w:rFonts w:ascii="Times New Roman" w:hAnsi="Times New Roman"/>
-          <w:b w:val="0"/>
-          <w:i w:val="0"/>
-          <w:color w:val="000000"/>
-          <w:sz w:val="24"/>
-          <w:u w:val="none"/>
-        </w:rPr>
-        <w:t xml:space="preserve"> небе́сною ся́є сві́тлістю.</w:t>
+          <w:color w:val="000000"/>
+          <w:sz w:val="24"/>
+        </w:rPr>
+        <w:t xml:space="preserve"> </w:t>
+      </w:r>
+      <w:r>
+        <w:rPr>
+          <w:rFonts w:ascii="Times New Roman" w:hAnsi="Times New Roman"/>
+          <w:color w:val="000000"/>
+          <w:sz w:val="24"/>
+        </w:rPr>
+        <w:t>небе́сною</w:t>
+      </w:r>
+      <w:r>
+        <w:rPr>
+          <w:rFonts w:ascii="Times New Roman" w:hAnsi="Times New Roman"/>
+          <w:color w:val="000000"/>
+          <w:sz w:val="24"/>
+        </w:rPr>
+        <w:t xml:space="preserve"> </w:t>
+      </w:r>
+      <w:r>
+        <w:rPr>
+          <w:rFonts w:ascii="Times New Roman" w:hAnsi="Times New Roman"/>
+          <w:color w:val="000000"/>
+          <w:sz w:val="24"/>
+        </w:rPr>
+        <w:t>ся́є</w:t>
+      </w:r>
+      <w:r>
+        <w:rPr>
+          <w:rFonts w:ascii="Times New Roman" w:hAnsi="Times New Roman"/>
+          <w:color w:val="000000"/>
+          <w:sz w:val="24"/>
+        </w:rPr>
+        <w:t xml:space="preserve"> сві́тлістю.</w:t>
       </w:r>
       <w:r>
         <w:rPr>
@@ -2937,13 +3267,74 @@
       <w:r>
         <w:rPr>
           <w:rFonts w:ascii="Times New Roman" w:hAnsi="Times New Roman"/>
-          <w:b w:val="0"/>
-          <w:i w:val="0"/>
-          <w:color w:val="000000"/>
-          <w:sz w:val="24"/>
-          <w:u w:val="none"/>
-        </w:rPr>
-        <w:t xml:space="preserve"> О, несказа́нне милосе́рдя Твоє́, Влади́ко!</w:t>
+          <w:color w:val="000000"/>
+          <w:sz w:val="24"/>
+        </w:rPr>
+        <w:t xml:space="preserve"> О, </w:t>
+      </w:r>
+      <w:r>
+        <w:rPr>
+          <w:rFonts w:ascii="Times New Roman" w:hAnsi="Times New Roman"/>
+          <w:color w:val="000000"/>
+          <w:sz w:val="24"/>
+        </w:rPr>
+        <w:t>несказа́нне</w:t>
+      </w:r>
+      <w:r>
+        <w:rPr>
+          <w:rFonts w:ascii="Times New Roman" w:hAnsi="Times New Roman"/>
+          <w:color w:val="000000"/>
+          <w:sz w:val="24"/>
+        </w:rPr>
+        <w:t xml:space="preserve"> </w:t>
+      </w:r>
+      <w:r>
+        <w:rPr>
+          <w:rFonts w:ascii="Times New Roman" w:hAnsi="Times New Roman"/>
+          <w:color w:val="000000"/>
+          <w:sz w:val="24"/>
+        </w:rPr>
+        <w:t>милосе́рдя</w:t>
+      </w:r>
+      <w:r>
+        <w:rPr>
+          <w:rFonts w:ascii="Times New Roman" w:hAnsi="Times New Roman"/>
+          <w:color w:val="000000"/>
+          <w:sz w:val="24"/>
+        </w:rPr>
+        <w:t xml:space="preserve"> </w:t>
+      </w:r>
+      <w:r>
+        <w:rPr>
+          <w:rFonts w:ascii="Times New Roman" w:hAnsi="Times New Roman"/>
+          <w:color w:val="000000"/>
+          <w:sz w:val="24"/>
+        </w:rPr>
+        <w:t>Твоє</w:t>
+      </w:r>
+      <w:r>
+        <w:rPr>
+          <w:rFonts w:ascii="Times New Roman" w:hAnsi="Times New Roman"/>
+          <w:color w:val="000000"/>
+          <w:sz w:val="24"/>
+        </w:rPr>
+        <w:t xml:space="preserve">́, </w:t>
+      </w:r>
+      <w:r>
+        <w:rPr>
+          <w:rFonts w:ascii="Times New Roman" w:hAnsi="Times New Roman"/>
+          <w:color w:val="000000"/>
+          <w:sz w:val="24"/>
+        </w:rPr>
+        <w:t>Влади́ко</w:t>
+      </w:r>
+      <w:r>
+        <w:rPr>
+          <w:rFonts w:ascii="Times New Roman" w:hAnsi="Times New Roman"/>
+          <w:color w:val="000000"/>
+          <w:sz w:val="24"/>
+        </w:rPr>
+        <w:t>!</w:t>
       </w:r>
       <w:r>
         <w:rPr>
@@ -2955,13 +3346,90 @@
       <w:r>
         <w:rPr>
           <w:rFonts w:ascii="Times New Roman" w:hAnsi="Times New Roman"/>
-          <w:b w:val="0"/>
-          <w:i w:val="0"/>
-          <w:color w:val="000000"/>
-          <w:sz w:val="24"/>
-          <w:u w:val="none"/>
-        </w:rPr>
-        <w:t xml:space="preserve"> Ним, Хри́сте, спаси́ ду́ші на́ші,</w:t>
+          <w:color w:val="000000"/>
+          <w:sz w:val="24"/>
+        </w:rPr>
+        <w:t xml:space="preserve"> </w:t>
+      </w:r>
+      <w:r>
+        <w:rPr>
+          <w:rFonts w:ascii="Times New Roman" w:hAnsi="Times New Roman"/>
+          <w:color w:val="000000"/>
+          <w:sz w:val="24"/>
+        </w:rPr>
+        <w:t>Ним</w:t>
+      </w:r>
+      <w:r>
+        <w:rPr>
+          <w:rFonts w:ascii="Times New Roman" w:hAnsi="Times New Roman"/>
+          <w:color w:val="000000"/>
+          <w:sz w:val="24"/>
+        </w:rPr>
+        <w:t xml:space="preserve">, </w:t>
+      </w:r>
+      <w:r>
+        <w:rPr>
+          <w:rFonts w:ascii="Times New Roman" w:hAnsi="Times New Roman"/>
+          <w:color w:val="000000"/>
+          <w:sz w:val="24"/>
+        </w:rPr>
+        <w:t>Хри́сте</w:t>
+      </w:r>
+      <w:r>
+        <w:rPr>
+          <w:rFonts w:ascii="Times New Roman" w:hAnsi="Times New Roman"/>
+          <w:color w:val="000000"/>
+          <w:sz w:val="24"/>
+        </w:rPr>
+        <w:t xml:space="preserve">, </w:t>
+      </w:r>
+      <w:r>
+        <w:rPr>
+          <w:rFonts w:ascii="Times New Roman" w:hAnsi="Times New Roman"/>
+          <w:color w:val="000000"/>
+          <w:sz w:val="24"/>
+        </w:rPr>
+        <w:t>спаси</w:t>
+      </w:r>
+      <w:r>
+        <w:rPr>
+          <w:rFonts w:ascii="Times New Roman" w:hAnsi="Times New Roman"/>
+          <w:color w:val="000000"/>
+          <w:sz w:val="24"/>
+        </w:rPr>
+        <w:t xml:space="preserve">́ </w:t>
+      </w:r>
+      <w:r>
+        <w:rPr>
+          <w:rFonts w:ascii="Times New Roman" w:hAnsi="Times New Roman"/>
+          <w:color w:val="000000"/>
+          <w:sz w:val="24"/>
+        </w:rPr>
+        <w:t>ду́ші</w:t>
+      </w:r>
+      <w:r>
+        <w:rPr>
+          <w:rFonts w:ascii="Times New Roman" w:hAnsi="Times New Roman"/>
+          <w:color w:val="000000"/>
+          <w:sz w:val="24"/>
+        </w:rPr>
+        <w:t xml:space="preserve"> </w:t>
+      </w:r>
+      <w:r>
+        <w:rPr>
+          <w:rFonts w:ascii="Times New Roman" w:hAnsi="Times New Roman"/>
+          <w:color w:val="000000"/>
+          <w:sz w:val="24"/>
+        </w:rPr>
+        <w:t>на́ші</w:t>
+      </w:r>
+      <w:r>
+        <w:rPr>
+          <w:rFonts w:ascii="Times New Roman" w:hAnsi="Times New Roman"/>
+          <w:color w:val="000000"/>
+          <w:sz w:val="24"/>
+        </w:rPr>
+        <w:t>,</w:t>
       </w:r>
       <w:r>
         <w:rPr>
@@ -2973,13 +3441,74 @@
       <w:r>
         <w:rPr>
           <w:rFonts w:ascii="Times New Roman" w:hAnsi="Times New Roman"/>
-          <w:b w:val="0"/>
-          <w:i w:val="0"/>
-          <w:color w:val="000000"/>
-          <w:sz w:val="24"/>
-          <w:u w:val="none"/>
-        </w:rPr>
-        <w:t xml:space="preserve"> як єди́ний, по́вний ми́лости.</w:t>
+          <w:color w:val="000000"/>
+          <w:sz w:val="24"/>
+        </w:rPr>
+        <w:t xml:space="preserve"> </w:t>
+      </w:r>
+      <w:r>
+        <w:rPr>
+          <w:rFonts w:ascii="Times New Roman" w:hAnsi="Times New Roman"/>
+          <w:color w:val="000000"/>
+          <w:sz w:val="24"/>
+        </w:rPr>
+        <w:t>як</w:t>
+      </w:r>
+      <w:r>
+        <w:rPr>
+          <w:rFonts w:ascii="Times New Roman" w:hAnsi="Times New Roman"/>
+          <w:color w:val="000000"/>
+          <w:sz w:val="24"/>
+        </w:rPr>
+        <w:t xml:space="preserve"> </w:t>
+      </w:r>
+      <w:r>
+        <w:rPr>
+          <w:rFonts w:ascii="Times New Roman" w:hAnsi="Times New Roman"/>
+          <w:color w:val="000000"/>
+          <w:sz w:val="24"/>
+        </w:rPr>
+        <w:t>єди́ний</w:t>
+      </w:r>
+      <w:r>
+        <w:rPr>
+          <w:rFonts w:ascii="Times New Roman" w:hAnsi="Times New Roman"/>
+          <w:color w:val="000000"/>
+          <w:sz w:val="24"/>
+        </w:rPr>
+        <w:t xml:space="preserve">, </w:t>
+      </w:r>
+      <w:r>
+        <w:rPr>
+          <w:rFonts w:ascii="Times New Roman" w:hAnsi="Times New Roman"/>
+          <w:color w:val="000000"/>
+          <w:sz w:val="24"/>
+        </w:rPr>
+        <w:t>по́вний</w:t>
+      </w:r>
+      <w:r>
+        <w:rPr>
+          <w:rFonts w:ascii="Times New Roman" w:hAnsi="Times New Roman"/>
+          <w:color w:val="000000"/>
+          <w:sz w:val="24"/>
+        </w:rPr>
+        <w:t xml:space="preserve"> </w:t>
+      </w:r>
+      <w:r>
+        <w:rPr>
+          <w:rFonts w:ascii="Times New Roman" w:hAnsi="Times New Roman"/>
+          <w:color w:val="000000"/>
+          <w:sz w:val="24"/>
+        </w:rPr>
+        <w:t>ми́лости</w:t>
+      </w:r>
+      <w:r>
+        <w:rPr>
+          <w:rFonts w:ascii="Times New Roman" w:hAnsi="Times New Roman"/>
+          <w:color w:val="000000"/>
+          <w:sz w:val="24"/>
+        </w:rPr>
+        <w:t>.</w:t>
       </w:r>
     </w:p>
     <w:p>
@@ -3036,13 +3565,50 @@
       <w:r>
         <w:rPr>
           <w:rFonts w:ascii="Times New Roman" w:hAnsi="Times New Roman"/>
-          <w:b w:val="0"/>
-          <w:i w:val="0"/>
-          <w:color w:val="000000"/>
-          <w:sz w:val="24"/>
-          <w:u w:val="none"/>
-        </w:rPr>
-        <w:t>Єрусали́м пробі́г ти,</w:t>
+          <w:color w:val="000000"/>
+          <w:sz w:val="24"/>
+        </w:rPr>
+        <w:t>Єрусали́м</w:t>
+      </w:r>
+      <w:r>
+        <w:rPr>
+          <w:rFonts w:ascii="Times New Roman" w:hAnsi="Times New Roman"/>
+          <w:color w:val="000000"/>
+          <w:sz w:val="24"/>
+        </w:rPr>
+        <w:t xml:space="preserve"> </w:t>
+      </w:r>
+      <w:r>
+        <w:rPr>
+          <w:rFonts w:ascii="Times New Roman" w:hAnsi="Times New Roman"/>
+          <w:color w:val="000000"/>
+          <w:sz w:val="24"/>
+        </w:rPr>
+        <w:t>пробі́г</w:t>
+      </w:r>
+      <w:r>
+        <w:rPr>
+          <w:rFonts w:ascii="Times New Roman" w:hAnsi="Times New Roman"/>
+          <w:color w:val="000000"/>
+          <w:sz w:val="24"/>
+        </w:rPr>
+        <w:t xml:space="preserve"> </w:t>
+      </w:r>
+      <w:r>
+        <w:rPr>
+          <w:rFonts w:ascii="Times New Roman" w:hAnsi="Times New Roman"/>
+          <w:color w:val="000000"/>
+          <w:sz w:val="24"/>
+        </w:rPr>
+        <w:t>ти</w:t>
+      </w:r>
+      <w:r>
+        <w:rPr>
+          <w:rFonts w:ascii="Times New Roman" w:hAnsi="Times New Roman"/>
+          <w:color w:val="000000"/>
+          <w:sz w:val="24"/>
+        </w:rPr>
+        <w:t>,</w:t>
       </w:r>
       <w:r>
         <w:rPr>
@@ -3054,13 +3620,58 @@
       <w:r>
         <w:rPr>
           <w:rFonts w:ascii="Times New Roman" w:hAnsi="Times New Roman"/>
-          <w:b w:val="0"/>
-          <w:i w:val="0"/>
-          <w:color w:val="000000"/>
-          <w:sz w:val="24"/>
-          <w:u w:val="none"/>
-        </w:rPr>
-        <w:t xml:space="preserve"> го́род Бо́жий сві́тлий,</w:t>
+          <w:color w:val="000000"/>
+          <w:sz w:val="24"/>
+        </w:rPr>
+        <w:t xml:space="preserve"> </w:t>
+      </w:r>
+      <w:r>
+        <w:rPr>
+          <w:rFonts w:ascii="Times New Roman" w:hAnsi="Times New Roman"/>
+          <w:color w:val="000000"/>
+          <w:sz w:val="24"/>
+        </w:rPr>
+        <w:t>го́род</w:t>
+      </w:r>
+      <w:r>
+        <w:rPr>
+          <w:rFonts w:ascii="Times New Roman" w:hAnsi="Times New Roman"/>
+          <w:color w:val="000000"/>
+          <w:sz w:val="24"/>
+        </w:rPr>
+        <w:t xml:space="preserve"> </w:t>
+      </w:r>
+      <w:r>
+        <w:rPr>
+          <w:rFonts w:ascii="Times New Roman" w:hAnsi="Times New Roman"/>
+          <w:color w:val="000000"/>
+          <w:sz w:val="24"/>
+        </w:rPr>
+        <w:t>Бо́жий</w:t>
+      </w:r>
+      <w:r>
+        <w:rPr>
+          <w:rFonts w:ascii="Times New Roman" w:hAnsi="Times New Roman"/>
+          <w:color w:val="000000"/>
+          <w:sz w:val="24"/>
+        </w:rPr>
+        <w:t xml:space="preserve"> </w:t>
+      </w:r>
+      <w:r>
+        <w:rPr>
+          <w:rFonts w:ascii="Times New Roman" w:hAnsi="Times New Roman"/>
+          <w:color w:val="000000"/>
+          <w:sz w:val="24"/>
+        </w:rPr>
+        <w:t>сві́тлий</w:t>
+      </w:r>
+      <w:r>
+        <w:rPr>
+          <w:rFonts w:ascii="Times New Roman" w:hAnsi="Times New Roman"/>
+          <w:color w:val="000000"/>
+          <w:sz w:val="24"/>
+        </w:rPr>
+        <w:t>,</w:t>
       </w:r>
       <w:r>
         <w:rPr>
@@ -3072,13 +3683,82 @@
       <w:r>
         <w:rPr>
           <w:rFonts w:ascii="Times New Roman" w:hAnsi="Times New Roman"/>
-          <w:b w:val="0"/>
-          <w:i w:val="0"/>
-          <w:color w:val="000000"/>
-          <w:sz w:val="24"/>
-          <w:u w:val="none"/>
-        </w:rPr>
-        <w:t xml:space="preserve"> бу́дучи, як ка́мінь, оба́грений кро́в’ю</w:t>
+          <w:color w:val="000000"/>
+          <w:sz w:val="24"/>
+        </w:rPr>
+        <w:t xml:space="preserve"> </w:t>
+      </w:r>
+      <w:r>
+        <w:rPr>
+          <w:rFonts w:ascii="Times New Roman" w:hAnsi="Times New Roman"/>
+          <w:color w:val="000000"/>
+          <w:sz w:val="24"/>
+        </w:rPr>
+        <w:t>бу́дучи</w:t>
+      </w:r>
+      <w:r>
+        <w:rPr>
+          <w:rFonts w:ascii="Times New Roman" w:hAnsi="Times New Roman"/>
+          <w:color w:val="000000"/>
+          <w:sz w:val="24"/>
+        </w:rPr>
+        <w:t xml:space="preserve">, </w:t>
+      </w:r>
+      <w:r>
+        <w:rPr>
+          <w:rFonts w:ascii="Times New Roman" w:hAnsi="Times New Roman"/>
+          <w:color w:val="000000"/>
+          <w:sz w:val="24"/>
+        </w:rPr>
+        <w:t>як</w:t>
+      </w:r>
+      <w:r>
+        <w:rPr>
+          <w:rFonts w:ascii="Times New Roman" w:hAnsi="Times New Roman"/>
+          <w:color w:val="000000"/>
+          <w:sz w:val="24"/>
+        </w:rPr>
+        <w:t xml:space="preserve"> </w:t>
+      </w:r>
+      <w:r>
+        <w:rPr>
+          <w:rFonts w:ascii="Times New Roman" w:hAnsi="Times New Roman"/>
+          <w:color w:val="000000"/>
+          <w:sz w:val="24"/>
+        </w:rPr>
+        <w:t>ка́мінь</w:t>
+      </w:r>
+      <w:r>
+        <w:rPr>
+          <w:rFonts w:ascii="Times New Roman" w:hAnsi="Times New Roman"/>
+          <w:color w:val="000000"/>
+          <w:sz w:val="24"/>
+        </w:rPr>
+        <w:t xml:space="preserve">, </w:t>
+      </w:r>
+      <w:r>
+        <w:rPr>
+          <w:rFonts w:ascii="Times New Roman" w:hAnsi="Times New Roman"/>
+          <w:color w:val="000000"/>
+          <w:sz w:val="24"/>
+        </w:rPr>
+        <w:t>оба́грений</w:t>
+      </w:r>
+      <w:r>
+        <w:rPr>
+          <w:rFonts w:ascii="Times New Roman" w:hAnsi="Times New Roman"/>
+          <w:color w:val="000000"/>
+          <w:sz w:val="24"/>
+        </w:rPr>
+        <w:t xml:space="preserve"> </w:t>
+      </w:r>
+      <w:r>
+        <w:rPr>
+          <w:rFonts w:ascii="Times New Roman" w:hAnsi="Times New Roman"/>
+          <w:color w:val="000000"/>
+          <w:sz w:val="24"/>
+        </w:rPr>
+        <w:t>кро́в’ю</w:t>
       </w:r>
       <w:r>
         <w:rPr>
@@ -3090,13 +3770,26 @@
       <w:r>
         <w:rPr>
           <w:rFonts w:ascii="Times New Roman" w:hAnsi="Times New Roman"/>
-          <w:b w:val="0"/>
-          <w:i w:val="0"/>
-          <w:color w:val="000000"/>
-          <w:sz w:val="24"/>
-          <w:u w:val="none"/>
-        </w:rPr>
-        <w:t xml:space="preserve"> – черлени́цею стражда́ння.</w:t>
+          <w:color w:val="000000"/>
+          <w:sz w:val="24"/>
+        </w:rPr>
+        <w:t xml:space="preserve"> – </w:t>
+      </w:r>
+      <w:r>
+        <w:rPr>
+          <w:rFonts w:ascii="Times New Roman" w:hAnsi="Times New Roman"/>
+          <w:color w:val="000000"/>
+          <w:sz w:val="24"/>
+        </w:rPr>
+        <w:t>черлени́цею</w:t>
+      </w:r>
+      <w:r>
+        <w:rPr>
+          <w:rFonts w:ascii="Times New Roman" w:hAnsi="Times New Roman"/>
+          <w:color w:val="000000"/>
+          <w:sz w:val="24"/>
+        </w:rPr>
+        <w:t xml:space="preserve"> стражда́ння.</w:t>
       </w:r>
       <w:r>
         <w:rPr>
@@ -3108,13 +3801,58 @@
       <w:r>
         <w:rPr>
           <w:rFonts w:ascii="Times New Roman" w:hAnsi="Times New Roman"/>
-          <w:b w:val="0"/>
-          <w:i w:val="0"/>
-          <w:color w:val="000000"/>
-          <w:sz w:val="24"/>
-          <w:u w:val="none"/>
-        </w:rPr>
-        <w:t xml:space="preserve"> І ни́ні моли́ся я́вно,</w:t>
+          <w:color w:val="000000"/>
+          <w:sz w:val="24"/>
+        </w:rPr>
+        <w:t xml:space="preserve"> І </w:t>
+      </w:r>
+      <w:r>
+        <w:rPr>
+          <w:rFonts w:ascii="Times New Roman" w:hAnsi="Times New Roman"/>
+          <w:color w:val="000000"/>
+          <w:sz w:val="24"/>
+        </w:rPr>
+        <w:t>ни́ні</w:t>
+      </w:r>
+      <w:r>
+        <w:rPr>
+          <w:rFonts w:ascii="Times New Roman" w:hAnsi="Times New Roman"/>
+          <w:color w:val="000000"/>
+          <w:sz w:val="24"/>
+        </w:rPr>
+        <w:t xml:space="preserve"> </w:t>
+      </w:r>
+      <w:r>
+        <w:rPr>
+          <w:rFonts w:ascii="Times New Roman" w:hAnsi="Times New Roman"/>
+          <w:color w:val="000000"/>
+          <w:sz w:val="24"/>
+        </w:rPr>
+        <w:t>моли́ся</w:t>
+      </w:r>
+      <w:r>
+        <w:rPr>
+          <w:rFonts w:ascii="Times New Roman" w:hAnsi="Times New Roman"/>
+          <w:color w:val="000000"/>
+          <w:sz w:val="24"/>
+        </w:rPr>
+        <w:t xml:space="preserve"> </w:t>
+      </w:r>
+      <w:r>
+        <w:rPr>
+          <w:rFonts w:ascii="Times New Roman" w:hAnsi="Times New Roman"/>
+          <w:color w:val="000000"/>
+          <w:sz w:val="24"/>
+        </w:rPr>
+        <w:t>я́вно</w:t>
+      </w:r>
+      <w:r>
+        <w:rPr>
+          <w:rFonts w:ascii="Times New Roman" w:hAnsi="Times New Roman"/>
+          <w:color w:val="000000"/>
+          <w:sz w:val="24"/>
+        </w:rPr>
+        <w:t>,</w:t>
       </w:r>
       <w:r>
         <w:rPr>
@@ -3126,13 +3864,42 @@
       <w:r>
         <w:rPr>
           <w:rFonts w:ascii="Times New Roman" w:hAnsi="Times New Roman"/>
-          <w:b w:val="0"/>
-          <w:i w:val="0"/>
-          <w:color w:val="000000"/>
-          <w:sz w:val="24"/>
-          <w:u w:val="none"/>
-        </w:rPr>
-        <w:t xml:space="preserve"> лику́ючи і раді́ючи,</w:t>
+          <w:color w:val="000000"/>
+          <w:sz w:val="24"/>
+        </w:rPr>
+        <w:t xml:space="preserve"> </w:t>
+      </w:r>
+      <w:r>
+        <w:rPr>
+          <w:rFonts w:ascii="Times New Roman" w:hAnsi="Times New Roman"/>
+          <w:color w:val="000000"/>
+          <w:sz w:val="24"/>
+        </w:rPr>
+        <w:t>лику́ючи</w:t>
+      </w:r>
+      <w:r>
+        <w:rPr>
+          <w:rFonts w:ascii="Times New Roman" w:hAnsi="Times New Roman"/>
+          <w:color w:val="000000"/>
+          <w:sz w:val="24"/>
+        </w:rPr>
+        <w:t xml:space="preserve"> і </w:t>
+      </w:r>
+      <w:r>
+        <w:rPr>
+          <w:rFonts w:ascii="Times New Roman" w:hAnsi="Times New Roman"/>
+          <w:color w:val="000000"/>
+          <w:sz w:val="24"/>
+        </w:rPr>
+        <w:t>раді́ючи</w:t>
+      </w:r>
+      <w:r>
+        <w:rPr>
+          <w:rFonts w:ascii="Times New Roman" w:hAnsi="Times New Roman"/>
+          <w:color w:val="000000"/>
+          <w:sz w:val="24"/>
+        </w:rPr>
+        <w:t>,</w:t>
       </w:r>
       <w:r>
         <w:rPr>
@@ -3144,13 +3911,50 @@
       <w:r>
         <w:rPr>
           <w:rFonts w:ascii="Times New Roman" w:hAnsi="Times New Roman"/>
-          <w:b w:val="0"/>
-          <w:i w:val="0"/>
-          <w:color w:val="000000"/>
-          <w:sz w:val="24"/>
-          <w:u w:val="none"/>
-        </w:rPr>
-        <w:t xml:space="preserve"> і спаса́й моли́твами твої́ми</w:t>
+          <w:color w:val="000000"/>
+          <w:sz w:val="24"/>
+        </w:rPr>
+        <w:t xml:space="preserve"> і </w:t>
+      </w:r>
+      <w:r>
+        <w:rPr>
+          <w:rFonts w:ascii="Times New Roman" w:hAnsi="Times New Roman"/>
+          <w:color w:val="000000"/>
+          <w:sz w:val="24"/>
+        </w:rPr>
+        <w:t>спаса́й</w:t>
+      </w:r>
+      <w:r>
+        <w:rPr>
+          <w:rFonts w:ascii="Times New Roman" w:hAnsi="Times New Roman"/>
+          <w:color w:val="000000"/>
+          <w:sz w:val="24"/>
+        </w:rPr>
+        <w:t xml:space="preserve"> </w:t>
+      </w:r>
+      <w:r>
+        <w:rPr>
+          <w:rFonts w:ascii="Times New Roman" w:hAnsi="Times New Roman"/>
+          <w:color w:val="000000"/>
+          <w:sz w:val="24"/>
+        </w:rPr>
+        <w:t>моли́твами</w:t>
+      </w:r>
+      <w:r>
+        <w:rPr>
+          <w:rFonts w:ascii="Times New Roman" w:hAnsi="Times New Roman"/>
+          <w:color w:val="000000"/>
+          <w:sz w:val="24"/>
+        </w:rPr>
+        <w:t xml:space="preserve"> </w:t>
+      </w:r>
+      <w:r>
+        <w:rPr>
+          <w:rFonts w:ascii="Times New Roman" w:hAnsi="Times New Roman"/>
+          <w:color w:val="000000"/>
+          <w:sz w:val="24"/>
+        </w:rPr>
+        <w:t>твої́ми</w:t>
       </w:r>
       <w:r>
         <w:rPr>
@@ -3162,13 +3966,98 @@
       <w:r>
         <w:rPr>
           <w:rFonts w:ascii="Times New Roman" w:hAnsi="Times New Roman"/>
-          <w:b w:val="0"/>
-          <w:i w:val="0"/>
-          <w:color w:val="000000"/>
-          <w:sz w:val="24"/>
-          <w:u w:val="none"/>
-        </w:rPr>
-        <w:t xml:space="preserve"> тих, що твою́ пресла́вну і свяще́нну па́м’ять</w:t>
+          <w:color w:val="000000"/>
+          <w:sz w:val="24"/>
+        </w:rPr>
+        <w:t xml:space="preserve"> </w:t>
+      </w:r>
+      <w:r>
+        <w:rPr>
+          <w:rFonts w:ascii="Times New Roman" w:hAnsi="Times New Roman"/>
+          <w:color w:val="000000"/>
+          <w:sz w:val="24"/>
+        </w:rPr>
+        <w:t>тих</w:t>
+      </w:r>
+      <w:r>
+        <w:rPr>
+          <w:rFonts w:ascii="Times New Roman" w:hAnsi="Times New Roman"/>
+          <w:color w:val="000000"/>
+          <w:sz w:val="24"/>
+        </w:rPr>
+        <w:t xml:space="preserve">, </w:t>
+      </w:r>
+      <w:r>
+        <w:rPr>
+          <w:rFonts w:ascii="Times New Roman" w:hAnsi="Times New Roman"/>
+          <w:color w:val="000000"/>
+          <w:sz w:val="24"/>
+        </w:rPr>
+        <w:t>що</w:t>
+      </w:r>
+      <w:r>
+        <w:rPr>
+          <w:rFonts w:ascii="Times New Roman" w:hAnsi="Times New Roman"/>
+          <w:color w:val="000000"/>
+          <w:sz w:val="24"/>
+        </w:rPr>
+        <w:t xml:space="preserve"> </w:t>
+      </w:r>
+      <w:r>
+        <w:rPr>
+          <w:rFonts w:ascii="Times New Roman" w:hAnsi="Times New Roman"/>
+          <w:color w:val="000000"/>
+          <w:sz w:val="24"/>
+        </w:rPr>
+        <w:t>твою</w:t>
+      </w:r>
+      <w:r>
+        <w:rPr>
+          <w:rFonts w:ascii="Times New Roman" w:hAnsi="Times New Roman"/>
+          <w:color w:val="000000"/>
+          <w:sz w:val="24"/>
+        </w:rPr>
+        <w:t xml:space="preserve">́ </w:t>
+      </w:r>
+      <w:r>
+        <w:rPr>
+          <w:rFonts w:ascii="Times New Roman" w:hAnsi="Times New Roman"/>
+          <w:color w:val="000000"/>
+          <w:sz w:val="24"/>
+        </w:rPr>
+        <w:t>пресла́вну</w:t>
+      </w:r>
+      <w:r>
+        <w:rPr>
+          <w:rFonts w:ascii="Times New Roman" w:hAnsi="Times New Roman"/>
+          <w:color w:val="000000"/>
+          <w:sz w:val="24"/>
+        </w:rPr>
+        <w:t xml:space="preserve"> і </w:t>
+      </w:r>
+      <w:r>
+        <w:rPr>
+          <w:rFonts w:ascii="Times New Roman" w:hAnsi="Times New Roman"/>
+          <w:color w:val="000000"/>
+          <w:sz w:val="24"/>
+        </w:rPr>
+        <w:t>свяще́нну</w:t>
+      </w:r>
+      <w:r>
+        <w:rPr>
+          <w:rFonts w:ascii="Times New Roman" w:hAnsi="Times New Roman"/>
+          <w:color w:val="000000"/>
+          <w:sz w:val="24"/>
+        </w:rPr>
+        <w:t xml:space="preserve"> </w:t>
+      </w:r>
+      <w:r>
+        <w:rPr>
+          <w:rFonts w:ascii="Times New Roman" w:hAnsi="Times New Roman"/>
+          <w:color w:val="000000"/>
+          <w:sz w:val="24"/>
+        </w:rPr>
+        <w:t>па́м’ять</w:t>
       </w:r>
       <w:r>
         <w:rPr>
@@ -3180,13 +4069,42 @@
       <w:r>
         <w:rPr>
           <w:rFonts w:ascii="Times New Roman" w:hAnsi="Times New Roman"/>
-          <w:b w:val="0"/>
-          <w:i w:val="0"/>
-          <w:color w:val="000000"/>
-          <w:sz w:val="24"/>
-          <w:u w:val="none"/>
-        </w:rPr>
-        <w:t xml:space="preserve"> святку́ють, преблаже́нний.</w:t>
+          <w:color w:val="000000"/>
+          <w:sz w:val="24"/>
+        </w:rPr>
+        <w:t xml:space="preserve"> </w:t>
+      </w:r>
+      <w:r>
+        <w:rPr>
+          <w:rFonts w:ascii="Times New Roman" w:hAnsi="Times New Roman"/>
+          <w:color w:val="000000"/>
+          <w:sz w:val="24"/>
+        </w:rPr>
+        <w:t>святку́ють</w:t>
+      </w:r>
+      <w:r>
+        <w:rPr>
+          <w:rFonts w:ascii="Times New Roman" w:hAnsi="Times New Roman"/>
+          <w:color w:val="000000"/>
+          <w:sz w:val="24"/>
+        </w:rPr>
+        <w:t xml:space="preserve">, </w:t>
+      </w:r>
+      <w:r>
+        <w:rPr>
+          <w:rFonts w:ascii="Times New Roman" w:hAnsi="Times New Roman"/>
+          <w:color w:val="000000"/>
+          <w:sz w:val="24"/>
+        </w:rPr>
+        <w:t>преблаже́нний</w:t>
+      </w:r>
+      <w:r>
+        <w:rPr>
+          <w:rFonts w:ascii="Times New Roman" w:hAnsi="Times New Roman"/>
+          <w:color w:val="000000"/>
+          <w:sz w:val="24"/>
+        </w:rPr>
+        <w:t>.</w:t>
       </w:r>
     </w:p>
     <w:p>
@@ -3227,13 +4145,66 @@
       <w:r>
         <w:rPr>
           <w:rFonts w:ascii="Times New Roman" w:hAnsi="Times New Roman"/>
-          <w:b w:val="0"/>
-          <w:i w:val="0"/>
-          <w:color w:val="000000"/>
-          <w:sz w:val="24"/>
-          <w:u w:val="none"/>
-        </w:rPr>
-        <w:t>Ма́ючи, як му́ченик неперемо́жний,</w:t>
+          <w:color w:val="000000"/>
+          <w:sz w:val="24"/>
+        </w:rPr>
+        <w:t>Ма́ючи</w:t>
+      </w:r>
+      <w:r>
+        <w:rPr>
+          <w:rFonts w:ascii="Times New Roman" w:hAnsi="Times New Roman"/>
+          <w:color w:val="000000"/>
+          <w:sz w:val="24"/>
+        </w:rPr>
+        <w:t xml:space="preserve">, </w:t>
+      </w:r>
+      <w:r>
+        <w:rPr>
+          <w:rFonts w:ascii="Times New Roman" w:hAnsi="Times New Roman"/>
+          <w:color w:val="000000"/>
+          <w:sz w:val="24"/>
+        </w:rPr>
+        <w:t>як</w:t>
+      </w:r>
+      <w:r>
+        <w:rPr>
+          <w:rFonts w:ascii="Times New Roman" w:hAnsi="Times New Roman"/>
+          <w:color w:val="000000"/>
+          <w:sz w:val="24"/>
+        </w:rPr>
+        <w:t xml:space="preserve"> </w:t>
+      </w:r>
+      <w:r>
+        <w:rPr>
+          <w:rFonts w:ascii="Times New Roman" w:hAnsi="Times New Roman"/>
+          <w:color w:val="000000"/>
+          <w:sz w:val="24"/>
+        </w:rPr>
+        <w:t>му́ченик</w:t>
+      </w:r>
+      <w:r>
+        <w:rPr>
+          <w:rFonts w:ascii="Times New Roman" w:hAnsi="Times New Roman"/>
+          <w:color w:val="000000"/>
+          <w:sz w:val="24"/>
+        </w:rPr>
+        <w:t xml:space="preserve"> </w:t>
+      </w:r>
+      <w:r>
+        <w:rPr>
+          <w:rFonts w:ascii="Times New Roman" w:hAnsi="Times New Roman"/>
+          <w:color w:val="000000"/>
+          <w:sz w:val="24"/>
+        </w:rPr>
+        <w:t>неперемо́жний</w:t>
+      </w:r>
+      <w:r>
+        <w:rPr>
+          <w:rFonts w:ascii="Times New Roman" w:hAnsi="Times New Roman"/>
+          <w:color w:val="000000"/>
+          <w:sz w:val="24"/>
+        </w:rPr>
+        <w:t>,</w:t>
       </w:r>
       <w:r>
         <w:rPr>
@@ -3245,13 +4216,34 @@
       <w:r>
         <w:rPr>
           <w:rFonts w:ascii="Times New Roman" w:hAnsi="Times New Roman"/>
-          <w:b w:val="0"/>
-          <w:i w:val="0"/>
-          <w:color w:val="000000"/>
-          <w:sz w:val="24"/>
-          <w:u w:val="none"/>
-        </w:rPr>
-        <w:t xml:space="preserve"> благоприє́мну сміли́вість</w:t>
+          <w:color w:val="000000"/>
+          <w:sz w:val="24"/>
+        </w:rPr>
+        <w:t xml:space="preserve"> </w:t>
+      </w:r>
+      <w:r>
+        <w:rPr>
+          <w:rFonts w:ascii="Times New Roman" w:hAnsi="Times New Roman"/>
+          <w:color w:val="000000"/>
+          <w:sz w:val="24"/>
+        </w:rPr>
+        <w:t>благоприє́мну</w:t>
+      </w:r>
+      <w:r>
+        <w:rPr>
+          <w:rFonts w:ascii="Times New Roman" w:hAnsi="Times New Roman"/>
+          <w:color w:val="000000"/>
+          <w:sz w:val="24"/>
+        </w:rPr>
+        <w:t xml:space="preserve"> </w:t>
+      </w:r>
+      <w:r>
+        <w:rPr>
+          <w:rFonts w:ascii="Times New Roman" w:hAnsi="Times New Roman"/>
+          <w:color w:val="000000"/>
+          <w:sz w:val="24"/>
+        </w:rPr>
+        <w:t>сміли́вість</w:t>
       </w:r>
       <w:r>
         <w:rPr>
@@ -3263,13 +4255,58 @@
       <w:r>
         <w:rPr>
           <w:rFonts w:ascii="Times New Roman" w:hAnsi="Times New Roman"/>
-          <w:b w:val="0"/>
-          <w:i w:val="0"/>
-          <w:color w:val="000000"/>
-          <w:sz w:val="24"/>
-          <w:u w:val="none"/>
-        </w:rPr>
-        <w:t xml:space="preserve"> до Влади́ки Христа́,</w:t>
+          <w:color w:val="000000"/>
+          <w:sz w:val="24"/>
+        </w:rPr>
+        <w:t xml:space="preserve"> </w:t>
+      </w:r>
+      <w:r>
+        <w:rPr>
+          <w:rFonts w:ascii="Times New Roman" w:hAnsi="Times New Roman"/>
+          <w:color w:val="000000"/>
+          <w:sz w:val="24"/>
+        </w:rPr>
+        <w:t>до</w:t>
+      </w:r>
+      <w:r>
+        <w:rPr>
+          <w:rFonts w:ascii="Times New Roman" w:hAnsi="Times New Roman"/>
+          <w:color w:val="000000"/>
+          <w:sz w:val="24"/>
+        </w:rPr>
+        <w:t xml:space="preserve"> </w:t>
+      </w:r>
+      <w:r>
+        <w:rPr>
+          <w:rFonts w:ascii="Times New Roman" w:hAnsi="Times New Roman"/>
+          <w:color w:val="000000"/>
+          <w:sz w:val="24"/>
+        </w:rPr>
+        <w:t>Влади́ки</w:t>
+      </w:r>
+      <w:r>
+        <w:rPr>
+          <w:rFonts w:ascii="Times New Roman" w:hAnsi="Times New Roman"/>
+          <w:color w:val="000000"/>
+          <w:sz w:val="24"/>
+        </w:rPr>
+        <w:t xml:space="preserve"> </w:t>
+      </w:r>
+      <w:r>
+        <w:rPr>
+          <w:rFonts w:ascii="Times New Roman" w:hAnsi="Times New Roman"/>
+          <w:color w:val="000000"/>
+          <w:sz w:val="24"/>
+        </w:rPr>
+        <w:t>Христа</w:t>
+      </w:r>
+      <w:r>
+        <w:rPr>
+          <w:rFonts w:ascii="Times New Roman" w:hAnsi="Times New Roman"/>
+          <w:color w:val="000000"/>
+          <w:sz w:val="24"/>
+        </w:rPr>
+        <w:t>́,</w:t>
       </w:r>
       <w:r>
         <w:rPr>
@@ -3281,13 +4318,74 @@
       <w:r>
         <w:rPr>
           <w:rFonts w:ascii="Times New Roman" w:hAnsi="Times New Roman"/>
-          <w:b w:val="0"/>
-          <w:i w:val="0"/>
-          <w:color w:val="000000"/>
-          <w:sz w:val="24"/>
-          <w:u w:val="none"/>
-        </w:rPr>
-        <w:t xml:space="preserve"> ти, як зако́нний стражда́лець,</w:t>
+          <w:color w:val="000000"/>
+          <w:sz w:val="24"/>
+        </w:rPr>
+        <w:t xml:space="preserve"> </w:t>
+      </w:r>
+      <w:r>
+        <w:rPr>
+          <w:rFonts w:ascii="Times New Roman" w:hAnsi="Times New Roman"/>
+          <w:color w:val="000000"/>
+          <w:sz w:val="24"/>
+        </w:rPr>
+        <w:t>ти</w:t>
+      </w:r>
+      <w:r>
+        <w:rPr>
+          <w:rFonts w:ascii="Times New Roman" w:hAnsi="Times New Roman"/>
+          <w:color w:val="000000"/>
+          <w:sz w:val="24"/>
+        </w:rPr>
+        <w:t xml:space="preserve">, </w:t>
+      </w:r>
+      <w:r>
+        <w:rPr>
+          <w:rFonts w:ascii="Times New Roman" w:hAnsi="Times New Roman"/>
+          <w:color w:val="000000"/>
+          <w:sz w:val="24"/>
+        </w:rPr>
+        <w:t>як</w:t>
+      </w:r>
+      <w:r>
+        <w:rPr>
+          <w:rFonts w:ascii="Times New Roman" w:hAnsi="Times New Roman"/>
+          <w:color w:val="000000"/>
+          <w:sz w:val="24"/>
+        </w:rPr>
+        <w:t xml:space="preserve"> </w:t>
+      </w:r>
+      <w:r>
+        <w:rPr>
+          <w:rFonts w:ascii="Times New Roman" w:hAnsi="Times New Roman"/>
+          <w:color w:val="000000"/>
+          <w:sz w:val="24"/>
+        </w:rPr>
+        <w:t>зако́нний</w:t>
+      </w:r>
+      <w:r>
+        <w:rPr>
+          <w:rFonts w:ascii="Times New Roman" w:hAnsi="Times New Roman"/>
+          <w:color w:val="000000"/>
+          <w:sz w:val="24"/>
+        </w:rPr>
+        <w:t xml:space="preserve"> </w:t>
+      </w:r>
+      <w:r>
+        <w:rPr>
+          <w:rFonts w:ascii="Times New Roman" w:hAnsi="Times New Roman"/>
+          <w:color w:val="000000"/>
+          <w:sz w:val="24"/>
+        </w:rPr>
+        <w:t>стражда́лець</w:t>
+      </w:r>
+      <w:r>
+        <w:rPr>
+          <w:rFonts w:ascii="Times New Roman" w:hAnsi="Times New Roman"/>
+          <w:color w:val="000000"/>
+          <w:sz w:val="24"/>
+        </w:rPr>
+        <w:t>,</w:t>
       </w:r>
       <w:r>
         <w:rPr>
@@ -3299,13 +4397,114 @@
       <w:r>
         <w:rPr>
           <w:rFonts w:ascii="Times New Roman" w:hAnsi="Times New Roman"/>
-          <w:b w:val="0"/>
-          <w:i w:val="0"/>
-          <w:color w:val="000000"/>
-          <w:sz w:val="24"/>
-          <w:u w:val="none"/>
-        </w:rPr>
-        <w:t xml:space="preserve"> не припиня́й доно́сити до слу́ху Його́ благода́тного</w:t>
+          <w:color w:val="000000"/>
+          <w:sz w:val="24"/>
+        </w:rPr>
+        <w:t xml:space="preserve"> </w:t>
+      </w:r>
+      <w:r>
+        <w:rPr>
+          <w:rFonts w:ascii="Times New Roman" w:hAnsi="Times New Roman"/>
+          <w:color w:val="000000"/>
+          <w:sz w:val="24"/>
+        </w:rPr>
+        <w:t>не</w:t>
+      </w:r>
+      <w:r>
+        <w:rPr>
+          <w:rFonts w:ascii="Times New Roman" w:hAnsi="Times New Roman"/>
+          <w:color w:val="000000"/>
+          <w:sz w:val="24"/>
+        </w:rPr>
+        <w:t xml:space="preserve"> </w:t>
+      </w:r>
+      <w:r>
+        <w:rPr>
+          <w:rFonts w:ascii="Times New Roman" w:hAnsi="Times New Roman"/>
+          <w:color w:val="000000"/>
+          <w:sz w:val="24"/>
+        </w:rPr>
+        <w:t>припиня́й</w:t>
+      </w:r>
+      <w:r>
+        <w:rPr>
+          <w:rFonts w:ascii="Times New Roman" w:hAnsi="Times New Roman"/>
+          <w:color w:val="000000"/>
+          <w:sz w:val="24"/>
+        </w:rPr>
+        <w:t xml:space="preserve"> </w:t>
+      </w:r>
+      <w:r>
+        <w:rPr>
+          <w:rFonts w:ascii="Times New Roman" w:hAnsi="Times New Roman"/>
+          <w:color w:val="000000"/>
+          <w:sz w:val="24"/>
+        </w:rPr>
+        <w:t>доно́сити</w:t>
+      </w:r>
+      <w:r>
+        <w:rPr>
+          <w:rFonts w:ascii="Times New Roman" w:hAnsi="Times New Roman"/>
+          <w:color w:val="000000"/>
+          <w:sz w:val="24"/>
+        </w:rPr>
+        <w:t xml:space="preserve"> </w:t>
+      </w:r>
+      <w:r>
+        <w:rPr>
+          <w:rFonts w:ascii="Times New Roman" w:hAnsi="Times New Roman"/>
+          <w:color w:val="000000"/>
+          <w:sz w:val="24"/>
+        </w:rPr>
+        <w:t>до</w:t>
+      </w:r>
+      <w:r>
+        <w:rPr>
+          <w:rFonts w:ascii="Times New Roman" w:hAnsi="Times New Roman"/>
+          <w:color w:val="000000"/>
+          <w:sz w:val="24"/>
+        </w:rPr>
+        <w:t xml:space="preserve"> </w:t>
+      </w:r>
+      <w:r>
+        <w:rPr>
+          <w:rFonts w:ascii="Times New Roman" w:hAnsi="Times New Roman"/>
+          <w:color w:val="000000"/>
+          <w:sz w:val="24"/>
+        </w:rPr>
+        <w:t>слу́ху</w:t>
+      </w:r>
+      <w:r>
+        <w:rPr>
+          <w:rFonts w:ascii="Times New Roman" w:hAnsi="Times New Roman"/>
+          <w:color w:val="000000"/>
+          <w:sz w:val="24"/>
+        </w:rPr>
+        <w:t xml:space="preserve"> </w:t>
+      </w:r>
+      <w:r>
+        <w:rPr>
+          <w:rFonts w:ascii="Times New Roman" w:hAnsi="Times New Roman"/>
+          <w:color w:val="000000"/>
+          <w:sz w:val="24"/>
+        </w:rPr>
+        <w:t>Його</w:t>
+      </w:r>
+      <w:r>
+        <w:rPr>
+          <w:rFonts w:ascii="Times New Roman" w:hAnsi="Times New Roman"/>
+          <w:color w:val="000000"/>
+          <w:sz w:val="24"/>
+        </w:rPr>
+        <w:t xml:space="preserve">́ </w:t>
+      </w:r>
+      <w:r>
+        <w:rPr>
+          <w:rFonts w:ascii="Times New Roman" w:hAnsi="Times New Roman"/>
+          <w:color w:val="000000"/>
+          <w:sz w:val="24"/>
+        </w:rPr>
+        <w:t>благода́тного</w:t>
       </w:r>
       <w:r>
         <w:rPr>
@@ -3317,13 +4516,58 @@
       <w:r>
         <w:rPr>
           <w:rFonts w:ascii="Times New Roman" w:hAnsi="Times New Roman"/>
-          <w:b w:val="0"/>
-          <w:i w:val="0"/>
-          <w:color w:val="000000"/>
-          <w:sz w:val="24"/>
-          <w:u w:val="none"/>
-        </w:rPr>
-        <w:t xml:space="preserve"> твої́ блага́ння, досточу́дний,</w:t>
+          <w:color w:val="000000"/>
+          <w:sz w:val="24"/>
+        </w:rPr>
+        <w:t xml:space="preserve"> </w:t>
+      </w:r>
+      <w:r>
+        <w:rPr>
+          <w:rFonts w:ascii="Times New Roman" w:hAnsi="Times New Roman"/>
+          <w:color w:val="000000"/>
+          <w:sz w:val="24"/>
+        </w:rPr>
+        <w:t>твої</w:t>
+      </w:r>
+      <w:r>
+        <w:rPr>
+          <w:rFonts w:ascii="Times New Roman" w:hAnsi="Times New Roman"/>
+          <w:color w:val="000000"/>
+          <w:sz w:val="24"/>
+        </w:rPr>
+        <w:t xml:space="preserve">́ </w:t>
+      </w:r>
+      <w:r>
+        <w:rPr>
+          <w:rFonts w:ascii="Times New Roman" w:hAnsi="Times New Roman"/>
+          <w:color w:val="000000"/>
+          <w:sz w:val="24"/>
+        </w:rPr>
+        <w:t>блага́ння</w:t>
+      </w:r>
+      <w:r>
+        <w:rPr>
+          <w:rFonts w:ascii="Times New Roman" w:hAnsi="Times New Roman"/>
+          <w:color w:val="000000"/>
+          <w:sz w:val="24"/>
+        </w:rPr>
+        <w:t xml:space="preserve">, </w:t>
+      </w:r>
+      <w:r>
+        <w:rPr>
+          <w:rFonts w:ascii="Times New Roman" w:hAnsi="Times New Roman"/>
+          <w:color w:val="000000"/>
+          <w:sz w:val="24"/>
+        </w:rPr>
+        <w:t>досточу́дний</w:t>
+      </w:r>
+      <w:r>
+        <w:rPr>
+          <w:rFonts w:ascii="Times New Roman" w:hAnsi="Times New Roman"/>
+          <w:color w:val="000000"/>
+          <w:sz w:val="24"/>
+        </w:rPr>
+        <w:t>,</w:t>
       </w:r>
       <w:r>
         <w:rPr>
@@ -3335,13 +4579,122 @@
       <w:r>
         <w:rPr>
           <w:rFonts w:ascii="Times New Roman" w:hAnsi="Times New Roman"/>
-          <w:b w:val="0"/>
-          <w:i w:val="0"/>
-          <w:color w:val="000000"/>
-          <w:sz w:val="24"/>
-          <w:u w:val="none"/>
-        </w:rPr>
-        <w:t xml:space="preserve"> тво́рячи па́м’ять тих, що ві́рно оспі́вують тебе́,</w:t>
+          <w:color w:val="000000"/>
+          <w:sz w:val="24"/>
+        </w:rPr>
+        <w:t xml:space="preserve"> </w:t>
+      </w:r>
+      <w:r>
+        <w:rPr>
+          <w:rFonts w:ascii="Times New Roman" w:hAnsi="Times New Roman"/>
+          <w:color w:val="000000"/>
+          <w:sz w:val="24"/>
+        </w:rPr>
+        <w:t>тво́рячи</w:t>
+      </w:r>
+      <w:r>
+        <w:rPr>
+          <w:rFonts w:ascii="Times New Roman" w:hAnsi="Times New Roman"/>
+          <w:color w:val="000000"/>
+          <w:sz w:val="24"/>
+        </w:rPr>
+        <w:t xml:space="preserve"> </w:t>
+      </w:r>
+      <w:r>
+        <w:rPr>
+          <w:rFonts w:ascii="Times New Roman" w:hAnsi="Times New Roman"/>
+          <w:color w:val="000000"/>
+          <w:sz w:val="24"/>
+        </w:rPr>
+        <w:t>па́м’ять</w:t>
+      </w:r>
+      <w:r>
+        <w:rPr>
+          <w:rFonts w:ascii="Times New Roman" w:hAnsi="Times New Roman"/>
+          <w:color w:val="000000"/>
+          <w:sz w:val="24"/>
+        </w:rPr>
+        <w:t xml:space="preserve"> </w:t>
+      </w:r>
+      <w:r>
+        <w:rPr>
+          <w:rFonts w:ascii="Times New Roman" w:hAnsi="Times New Roman"/>
+          <w:color w:val="000000"/>
+          <w:sz w:val="24"/>
+        </w:rPr>
+        <w:t>тих</w:t>
+      </w:r>
+      <w:r>
+        <w:rPr>
+          <w:rFonts w:ascii="Times New Roman" w:hAnsi="Times New Roman"/>
+          <w:color w:val="000000"/>
+          <w:sz w:val="24"/>
+        </w:rPr>
+        <w:t xml:space="preserve">, </w:t>
+      </w:r>
+      <w:r>
+        <w:rPr>
+          <w:rFonts w:ascii="Times New Roman" w:hAnsi="Times New Roman"/>
+          <w:color w:val="000000"/>
+          <w:sz w:val="24"/>
+        </w:rPr>
+        <w:t>що</w:t>
+      </w:r>
+      <w:r>
+        <w:rPr>
+          <w:rFonts w:ascii="Times New Roman" w:hAnsi="Times New Roman"/>
+          <w:color w:val="000000"/>
+          <w:sz w:val="24"/>
+        </w:rPr>
+        <w:t xml:space="preserve"> </w:t>
+      </w:r>
+      <w:r>
+        <w:rPr>
+          <w:rFonts w:ascii="Times New Roman" w:hAnsi="Times New Roman"/>
+          <w:color w:val="000000"/>
+          <w:sz w:val="24"/>
+        </w:rPr>
+        <w:t>ві́рно</w:t>
+      </w:r>
+      <w:r>
+        <w:rPr>
+          <w:rFonts w:ascii="Times New Roman" w:hAnsi="Times New Roman"/>
+          <w:color w:val="000000"/>
+          <w:sz w:val="24"/>
+        </w:rPr>
+        <w:t xml:space="preserve"> </w:t>
+      </w:r>
+      <w:r>
+        <w:rPr>
+          <w:rFonts w:ascii="Times New Roman" w:hAnsi="Times New Roman"/>
+          <w:color w:val="000000"/>
+          <w:sz w:val="24"/>
+        </w:rPr>
+        <w:t>оспі́вують</w:t>
+      </w:r>
+      <w:r>
+        <w:rPr>
+          <w:rFonts w:ascii="Times New Roman" w:hAnsi="Times New Roman"/>
+          <w:color w:val="000000"/>
+          <w:sz w:val="24"/>
+        </w:rPr>
+        <w:t xml:space="preserve"> </w:t>
+      </w:r>
+      <w:r>
+        <w:rPr>
+          <w:rFonts w:ascii="Times New Roman" w:hAnsi="Times New Roman"/>
+          <w:color w:val="000000"/>
+          <w:sz w:val="24"/>
+        </w:rPr>
+        <w:t>тебе</w:t>
+      </w:r>
+      <w:r>
+        <w:rPr>
+          <w:rFonts w:ascii="Times New Roman" w:hAnsi="Times New Roman"/>
+          <w:color w:val="000000"/>
+          <w:sz w:val="24"/>
+        </w:rPr>
+        <w:t>́,</w:t>
       </w:r>
       <w:r>
         <w:rPr>
@@ -3353,13 +4706,50 @@
       <w:r>
         <w:rPr>
           <w:rFonts w:ascii="Times New Roman" w:hAnsi="Times New Roman"/>
-          <w:b w:val="0"/>
-          <w:i w:val="0"/>
-          <w:color w:val="000000"/>
-          <w:sz w:val="24"/>
-          <w:u w:val="none"/>
-        </w:rPr>
-        <w:t xml:space="preserve"> і виво́дячи їх з на́пастей</w:t>
+          <w:color w:val="000000"/>
+          <w:sz w:val="24"/>
+        </w:rPr>
+        <w:t xml:space="preserve"> і </w:t>
+      </w:r>
+      <w:r>
+        <w:rPr>
+          <w:rFonts w:ascii="Times New Roman" w:hAnsi="Times New Roman"/>
+          <w:color w:val="000000"/>
+          <w:sz w:val="24"/>
+        </w:rPr>
+        <w:t>виво́дячи</w:t>
+      </w:r>
+      <w:r>
+        <w:rPr>
+          <w:rFonts w:ascii="Times New Roman" w:hAnsi="Times New Roman"/>
+          <w:color w:val="000000"/>
+          <w:sz w:val="24"/>
+        </w:rPr>
+        <w:t xml:space="preserve"> </w:t>
+      </w:r>
+      <w:r>
+        <w:rPr>
+          <w:rFonts w:ascii="Times New Roman" w:hAnsi="Times New Roman"/>
+          <w:color w:val="000000"/>
+          <w:sz w:val="24"/>
+        </w:rPr>
+        <w:t>їх</w:t>
+      </w:r>
+      <w:r>
+        <w:rPr>
+          <w:rFonts w:ascii="Times New Roman" w:hAnsi="Times New Roman"/>
+          <w:color w:val="000000"/>
+          <w:sz w:val="24"/>
+        </w:rPr>
+        <w:t xml:space="preserve"> з </w:t>
+      </w:r>
+      <w:r>
+        <w:rPr>
+          <w:rFonts w:ascii="Times New Roman" w:hAnsi="Times New Roman"/>
+          <w:color w:val="000000"/>
+          <w:sz w:val="24"/>
+        </w:rPr>
+        <w:t>на́пастей</w:t>
       </w:r>
       <w:r>
         <w:rPr>
@@ -3371,13 +4761,58 @@
       <w:r>
         <w:rPr>
           <w:rFonts w:ascii="Times New Roman" w:hAnsi="Times New Roman"/>
-          <w:b w:val="0"/>
-          <w:i w:val="0"/>
-          <w:color w:val="000000"/>
-          <w:sz w:val="24"/>
-          <w:u w:val="none"/>
-        </w:rPr>
-        <w:t xml:space="preserve"> та обло́ги лих.</w:t>
+          <w:color w:val="000000"/>
+          <w:sz w:val="24"/>
+        </w:rPr>
+        <w:t xml:space="preserve"> </w:t>
+      </w:r>
+      <w:r>
+        <w:rPr>
+          <w:rFonts w:ascii="Times New Roman" w:hAnsi="Times New Roman"/>
+          <w:color w:val="000000"/>
+          <w:sz w:val="24"/>
+        </w:rPr>
+        <w:t>та</w:t>
+      </w:r>
+      <w:r>
+        <w:rPr>
+          <w:rFonts w:ascii="Times New Roman" w:hAnsi="Times New Roman"/>
+          <w:color w:val="000000"/>
+          <w:sz w:val="24"/>
+        </w:rPr>
+        <w:t xml:space="preserve"> </w:t>
+      </w:r>
+      <w:r>
+        <w:rPr>
+          <w:rFonts w:ascii="Times New Roman" w:hAnsi="Times New Roman"/>
+          <w:color w:val="000000"/>
+          <w:sz w:val="24"/>
+        </w:rPr>
+        <w:t>обло́ги</w:t>
+      </w:r>
+      <w:r>
+        <w:rPr>
+          <w:rFonts w:ascii="Times New Roman" w:hAnsi="Times New Roman"/>
+          <w:color w:val="000000"/>
+          <w:sz w:val="24"/>
+        </w:rPr>
+        <w:t xml:space="preserve"> </w:t>
+      </w:r>
+      <w:r>
+        <w:rPr>
+          <w:rFonts w:ascii="Times New Roman" w:hAnsi="Times New Roman"/>
+          <w:color w:val="000000"/>
+          <w:sz w:val="24"/>
+        </w:rPr>
+        <w:t>лих</w:t>
+      </w:r>
+      <w:r>
+        <w:rPr>
+          <w:rFonts w:ascii="Times New Roman" w:hAnsi="Times New Roman"/>
+          <w:color w:val="000000"/>
+          <w:sz w:val="24"/>
+        </w:rPr>
+        <w:t>.</w:t>
       </w:r>
     </w:p>
     <w:p>
@@ -3389,45 +4824,151 @@
         <w:rPr>
           <w:rFonts w:ascii="Times New Roman" w:hAnsi="Times New Roman"/>
           <w:b/>
-          <w:i w:val="0"/>
-          <w:color w:val="000000"/>
-          <w:sz w:val="24"/>
-          <w:u w:val="none"/>
-        </w:rPr>
-        <w:t>Слава І нині</w:t>
-      </w:r>
-      <w:r>
-        <w:rPr>
-          <w:rFonts w:ascii="Times New Roman" w:hAnsi="Times New Roman"/>
-          <w:b w:val="0"/>
-          <w:i w:val="0"/>
-          <w:color w:val="000000"/>
-          <w:sz w:val="24"/>
-          <w:u w:val="none"/>
+          <w:color w:val="000000"/>
+          <w:sz w:val="24"/>
+        </w:rPr>
+        <w:t>Слава</w:t>
+      </w:r>
+      <w:r>
+        <w:rPr>
+          <w:rFonts w:ascii="Times New Roman" w:hAnsi="Times New Roman"/>
+          <w:b/>
+          <w:color w:val="000000"/>
+          <w:sz w:val="24"/>
+        </w:rPr>
+        <w:t xml:space="preserve"> І </w:t>
+      </w:r>
+      <w:r>
+        <w:rPr>
+          <w:rFonts w:ascii="Times New Roman" w:hAnsi="Times New Roman"/>
+          <w:b/>
+          <w:color w:val="000000"/>
+          <w:sz w:val="24"/>
+        </w:rPr>
+        <w:t>нині</w:t>
+      </w:r>
+      <w:r>
+        <w:rPr>
+          <w:rFonts w:ascii="Times New Roman" w:hAnsi="Times New Roman"/>
+          <w:color w:val="000000"/>
+          <w:sz w:val="24"/>
         </w:rPr>
         <w:t xml:space="preserve"> </w:t>
       </w:r>
       <w:r>
         <w:rPr>
           <w:rFonts w:ascii="Times New Roman" w:hAnsi="Times New Roman"/>
-          <w:b w:val="0"/>
           <w:i/>
           <w:color w:val="FF0000"/>
           <w:sz w:val="24"/>
-          <w:u w:val="none"/>
-        </w:rPr>
-        <w:t>(богородичний):</w:t>
-      </w:r>
-      <w:r>
-        <w:rPr>
-          <w:rFonts w:ascii="Times New Roman" w:hAnsi="Times New Roman"/>
-          <w:b w:val="0"/>
-          <w:i w:val="0"/>
-          <w:color w:val="000000"/>
-          <w:sz w:val="24"/>
-          <w:u w:val="none"/>
-        </w:rPr>
-        <w:t xml:space="preserve"> Плоть від кро́ви Твоє́ї прийня́вши,</w:t>
+        </w:rPr>
+        <w:t>(</w:t>
+      </w:r>
+      <w:r>
+        <w:rPr>
+          <w:rFonts w:ascii="Times New Roman" w:hAnsi="Times New Roman"/>
+          <w:i/>
+          <w:color w:val="FF0000"/>
+          <w:sz w:val="24"/>
+        </w:rPr>
+        <w:t>богородичний</w:t>
+      </w:r>
+      <w:r>
+        <w:rPr>
+          <w:rFonts w:ascii="Times New Roman" w:hAnsi="Times New Roman"/>
+          <w:i/>
+          <w:color w:val="FF0000"/>
+          <w:sz w:val="24"/>
+        </w:rPr>
+        <w:t>):</w:t>
+      </w:r>
+      <w:r>
+        <w:rPr>
+          <w:rFonts w:ascii="Times New Roman" w:hAnsi="Times New Roman"/>
+          <w:color w:val="000000"/>
+          <w:sz w:val="24"/>
+        </w:rPr>
+        <w:t xml:space="preserve"> </w:t>
+      </w:r>
+      <w:r>
+        <w:rPr>
+          <w:rFonts w:ascii="Times New Roman" w:hAnsi="Times New Roman"/>
+          <w:color w:val="000000"/>
+          <w:sz w:val="24"/>
+        </w:rPr>
+        <w:t>Плоть</w:t>
+      </w:r>
+      <w:r>
+        <w:rPr>
+          <w:rFonts w:ascii="Times New Roman" w:hAnsi="Times New Roman"/>
+          <w:color w:val="000000"/>
+          <w:sz w:val="24"/>
+        </w:rPr>
+        <w:t xml:space="preserve"> </w:t>
+      </w:r>
+      <w:r>
+        <w:rPr>
+          <w:rFonts w:ascii="Times New Roman" w:hAnsi="Times New Roman"/>
+          <w:color w:val="000000"/>
+          <w:sz w:val="24"/>
+        </w:rPr>
+        <w:t>від</w:t>
+      </w:r>
+      <w:r>
+        <w:rPr>
+          <w:rFonts w:ascii="Times New Roman" w:hAnsi="Times New Roman"/>
+          <w:color w:val="000000"/>
+          <w:sz w:val="24"/>
+        </w:rPr>
+        <w:t xml:space="preserve"> </w:t>
+      </w:r>
+      <w:r>
+        <w:rPr>
+          <w:rFonts w:ascii="Times New Roman" w:hAnsi="Times New Roman"/>
+          <w:color w:val="000000"/>
+          <w:sz w:val="24"/>
+        </w:rPr>
+        <w:t>кро́ви</w:t>
+      </w:r>
+      <w:r>
+        <w:rPr>
+          <w:rFonts w:ascii="Times New Roman" w:hAnsi="Times New Roman"/>
+          <w:color w:val="000000"/>
+          <w:sz w:val="24"/>
+        </w:rPr>
+        <w:t xml:space="preserve"> </w:t>
+      </w:r>
+      <w:r>
+        <w:rPr>
+          <w:rFonts w:ascii="Times New Roman" w:hAnsi="Times New Roman"/>
+          <w:color w:val="000000"/>
+          <w:sz w:val="24"/>
+        </w:rPr>
+        <w:t>Твоє́ї</w:t>
+      </w:r>
+      <w:r>
+        <w:rPr>
+          <w:rFonts w:ascii="Times New Roman" w:hAnsi="Times New Roman"/>
+          <w:color w:val="000000"/>
+          <w:sz w:val="24"/>
+        </w:rPr>
+        <w:t xml:space="preserve"> </w:t>
+      </w:r>
+      <w:r>
+        <w:rPr>
+          <w:rFonts w:ascii="Times New Roman" w:hAnsi="Times New Roman"/>
+          <w:color w:val="000000"/>
+          <w:sz w:val="24"/>
+        </w:rPr>
+        <w:t>прийня́вши</w:t>
+      </w:r>
+      <w:r>
+        <w:rPr>
+          <w:rFonts w:ascii="Times New Roman" w:hAnsi="Times New Roman"/>
+          <w:color w:val="000000"/>
+          <w:sz w:val="24"/>
+        </w:rPr>
+        <w:t>,</w:t>
       </w:r>
       <w:r>
         <w:rPr>
@@ -3439,13 +4980,34 @@
       <w:r>
         <w:rPr>
           <w:rFonts w:ascii="Times New Roman" w:hAnsi="Times New Roman"/>
-          <w:b w:val="0"/>
-          <w:i w:val="0"/>
-          <w:color w:val="000000"/>
-          <w:sz w:val="24"/>
-          <w:u w:val="none"/>
-        </w:rPr>
-        <w:t xml:space="preserve"> Первові́чний Бог</w:t>
+          <w:color w:val="000000"/>
+          <w:sz w:val="24"/>
+        </w:rPr>
+        <w:t xml:space="preserve"> </w:t>
+      </w:r>
+      <w:r>
+        <w:rPr>
+          <w:rFonts w:ascii="Times New Roman" w:hAnsi="Times New Roman"/>
+          <w:color w:val="000000"/>
+          <w:sz w:val="24"/>
+        </w:rPr>
+        <w:t>Первові́чний</w:t>
+      </w:r>
+      <w:r>
+        <w:rPr>
+          <w:rFonts w:ascii="Times New Roman" w:hAnsi="Times New Roman"/>
+          <w:color w:val="000000"/>
+          <w:sz w:val="24"/>
+        </w:rPr>
+        <w:t xml:space="preserve"> </w:t>
+      </w:r>
+      <w:r>
+        <w:rPr>
+          <w:rFonts w:ascii="Times New Roman" w:hAnsi="Times New Roman"/>
+          <w:color w:val="000000"/>
+          <w:sz w:val="24"/>
+        </w:rPr>
+        <w:t>Бог</w:t>
       </w:r>
       <w:r>
         <w:rPr>
@@ -3457,13 +5019,74 @@
       <w:r>
         <w:rPr>
           <w:rFonts w:ascii="Times New Roman" w:hAnsi="Times New Roman"/>
-          <w:b w:val="0"/>
-          <w:i w:val="0"/>
-          <w:color w:val="000000"/>
-          <w:sz w:val="24"/>
-          <w:u w:val="none"/>
-        </w:rPr>
-        <w:t xml:space="preserve"> показа́в Тебе́ Засту́пницею люде́й, Чи́стая.</w:t>
+          <w:color w:val="000000"/>
+          <w:sz w:val="24"/>
+        </w:rPr>
+        <w:t xml:space="preserve"> </w:t>
+      </w:r>
+      <w:r>
+        <w:rPr>
+          <w:rFonts w:ascii="Times New Roman" w:hAnsi="Times New Roman"/>
+          <w:color w:val="000000"/>
+          <w:sz w:val="24"/>
+        </w:rPr>
+        <w:t>показа́в</w:t>
+      </w:r>
+      <w:r>
+        <w:rPr>
+          <w:rFonts w:ascii="Times New Roman" w:hAnsi="Times New Roman"/>
+          <w:color w:val="000000"/>
+          <w:sz w:val="24"/>
+        </w:rPr>
+        <w:t xml:space="preserve"> </w:t>
+      </w:r>
+      <w:r>
+        <w:rPr>
+          <w:rFonts w:ascii="Times New Roman" w:hAnsi="Times New Roman"/>
+          <w:color w:val="000000"/>
+          <w:sz w:val="24"/>
+        </w:rPr>
+        <w:t>Тебе</w:t>
+      </w:r>
+      <w:r>
+        <w:rPr>
+          <w:rFonts w:ascii="Times New Roman" w:hAnsi="Times New Roman"/>
+          <w:color w:val="000000"/>
+          <w:sz w:val="24"/>
+        </w:rPr>
+        <w:t xml:space="preserve">́ </w:t>
+      </w:r>
+      <w:r>
+        <w:rPr>
+          <w:rFonts w:ascii="Times New Roman" w:hAnsi="Times New Roman"/>
+          <w:color w:val="000000"/>
+          <w:sz w:val="24"/>
+        </w:rPr>
+        <w:t>Засту́пницею</w:t>
+      </w:r>
+      <w:r>
+        <w:rPr>
+          <w:rFonts w:ascii="Times New Roman" w:hAnsi="Times New Roman"/>
+          <w:color w:val="000000"/>
+          <w:sz w:val="24"/>
+        </w:rPr>
+        <w:t xml:space="preserve"> </w:t>
+      </w:r>
+      <w:r>
+        <w:rPr>
+          <w:rFonts w:ascii="Times New Roman" w:hAnsi="Times New Roman"/>
+          <w:color w:val="000000"/>
+          <w:sz w:val="24"/>
+        </w:rPr>
+        <w:t>люде́й</w:t>
+      </w:r>
+      <w:r>
+        <w:rPr>
+          <w:rFonts w:ascii="Times New Roman" w:hAnsi="Times New Roman"/>
+          <w:color w:val="000000"/>
+          <w:sz w:val="24"/>
+        </w:rPr>
+        <w:t>, Чи́стая.</w:t>
       </w:r>
       <w:r>
         <w:rPr>
@@ -3475,13 +5098,66 @@
       <w:r>
         <w:rPr>
           <w:rFonts w:ascii="Times New Roman" w:hAnsi="Times New Roman"/>
-          <w:b w:val="0"/>
-          <w:i w:val="0"/>
-          <w:color w:val="000000"/>
-          <w:sz w:val="24"/>
-          <w:u w:val="none"/>
-        </w:rPr>
-        <w:t xml:space="preserve"> Тому́ ізба́в рабі́в твої́х</w:t>
+          <w:color w:val="000000"/>
+          <w:sz w:val="24"/>
+        </w:rPr>
+        <w:t xml:space="preserve"> </w:t>
+      </w:r>
+      <w:r>
+        <w:rPr>
+          <w:rFonts w:ascii="Times New Roman" w:hAnsi="Times New Roman"/>
+          <w:color w:val="000000"/>
+          <w:sz w:val="24"/>
+        </w:rPr>
+        <w:t>Тому</w:t>
+      </w:r>
+      <w:r>
+        <w:rPr>
+          <w:rFonts w:ascii="Times New Roman" w:hAnsi="Times New Roman"/>
+          <w:color w:val="000000"/>
+          <w:sz w:val="24"/>
+        </w:rPr>
+        <w:t xml:space="preserve">́ </w:t>
+      </w:r>
+      <w:r>
+        <w:rPr>
+          <w:rFonts w:ascii="Times New Roman" w:hAnsi="Times New Roman"/>
+          <w:color w:val="000000"/>
+          <w:sz w:val="24"/>
+        </w:rPr>
+        <w:t>ізба́в</w:t>
+      </w:r>
+      <w:r>
+        <w:rPr>
+          <w:rFonts w:ascii="Times New Roman" w:hAnsi="Times New Roman"/>
+          <w:color w:val="000000"/>
+          <w:sz w:val="24"/>
+        </w:rPr>
+        <w:t xml:space="preserve"> </w:t>
+      </w:r>
+      <w:r>
+        <w:rPr>
+          <w:rFonts w:ascii="Times New Roman" w:hAnsi="Times New Roman"/>
+          <w:color w:val="000000"/>
+          <w:sz w:val="24"/>
+        </w:rPr>
+        <w:t>рабі́в</w:t>
+      </w:r>
+      <w:r>
+        <w:rPr>
+          <w:rFonts w:ascii="Times New Roman" w:hAnsi="Times New Roman"/>
+          <w:color w:val="000000"/>
+          <w:sz w:val="24"/>
+        </w:rPr>
+        <w:t xml:space="preserve"> </w:t>
+      </w:r>
+      <w:r>
+        <w:rPr>
+          <w:rFonts w:ascii="Times New Roman" w:hAnsi="Times New Roman"/>
+          <w:color w:val="000000"/>
+          <w:sz w:val="24"/>
+        </w:rPr>
+        <w:t>твої́х</w:t>
       </w:r>
       <w:r>
         <w:rPr>
@@ -3493,13 +5169,90 @@
       <w:r>
         <w:rPr>
           <w:rFonts w:ascii="Times New Roman" w:hAnsi="Times New Roman"/>
-          <w:b w:val="0"/>
-          <w:i w:val="0"/>
-          <w:color w:val="000000"/>
-          <w:sz w:val="24"/>
-          <w:u w:val="none"/>
-        </w:rPr>
-        <w:t xml:space="preserve"> від уся́кої біди́ й обло́ги лих,</w:t>
+          <w:color w:val="000000"/>
+          <w:sz w:val="24"/>
+        </w:rPr>
+        <w:t xml:space="preserve"> </w:t>
+      </w:r>
+      <w:r>
+        <w:rPr>
+          <w:rFonts w:ascii="Times New Roman" w:hAnsi="Times New Roman"/>
+          <w:color w:val="000000"/>
+          <w:sz w:val="24"/>
+        </w:rPr>
+        <w:t>від</w:t>
+      </w:r>
+      <w:r>
+        <w:rPr>
+          <w:rFonts w:ascii="Times New Roman" w:hAnsi="Times New Roman"/>
+          <w:color w:val="000000"/>
+          <w:sz w:val="24"/>
+        </w:rPr>
+        <w:t xml:space="preserve"> </w:t>
+      </w:r>
+      <w:r>
+        <w:rPr>
+          <w:rFonts w:ascii="Times New Roman" w:hAnsi="Times New Roman"/>
+          <w:color w:val="000000"/>
+          <w:sz w:val="24"/>
+        </w:rPr>
+        <w:t>уся́кої</w:t>
+      </w:r>
+      <w:r>
+        <w:rPr>
+          <w:rFonts w:ascii="Times New Roman" w:hAnsi="Times New Roman"/>
+          <w:color w:val="000000"/>
+          <w:sz w:val="24"/>
+        </w:rPr>
+        <w:t xml:space="preserve"> </w:t>
+      </w:r>
+      <w:r>
+        <w:rPr>
+          <w:rFonts w:ascii="Times New Roman" w:hAnsi="Times New Roman"/>
+          <w:color w:val="000000"/>
+          <w:sz w:val="24"/>
+        </w:rPr>
+        <w:t>біди</w:t>
+      </w:r>
+      <w:r>
+        <w:rPr>
+          <w:rFonts w:ascii="Times New Roman" w:hAnsi="Times New Roman"/>
+          <w:color w:val="000000"/>
+          <w:sz w:val="24"/>
+        </w:rPr>
+        <w:t xml:space="preserve">́ й </w:t>
+      </w:r>
+      <w:r>
+        <w:rPr>
+          <w:rFonts w:ascii="Times New Roman" w:hAnsi="Times New Roman"/>
+          <w:color w:val="000000"/>
+          <w:sz w:val="24"/>
+        </w:rPr>
+        <w:t>обло́ги</w:t>
+      </w:r>
+      <w:r>
+        <w:rPr>
+          <w:rFonts w:ascii="Times New Roman" w:hAnsi="Times New Roman"/>
+          <w:color w:val="000000"/>
+          <w:sz w:val="24"/>
+        </w:rPr>
+        <w:t xml:space="preserve"> </w:t>
+      </w:r>
+      <w:r>
+        <w:rPr>
+          <w:rFonts w:ascii="Times New Roman" w:hAnsi="Times New Roman"/>
+          <w:color w:val="000000"/>
+          <w:sz w:val="24"/>
+        </w:rPr>
+        <w:t>лих</w:t>
+      </w:r>
+      <w:r>
+        <w:rPr>
+          <w:rFonts w:ascii="Times New Roman" w:hAnsi="Times New Roman"/>
+          <w:color w:val="000000"/>
+          <w:sz w:val="24"/>
+        </w:rPr>
+        <w:t>,</w:t>
       </w:r>
       <w:r>
         <w:rPr>
@@ -3511,13 +5264,74 @@
       <w:r>
         <w:rPr>
           <w:rFonts w:ascii="Times New Roman" w:hAnsi="Times New Roman"/>
-          <w:b w:val="0"/>
-          <w:i w:val="0"/>
-          <w:color w:val="000000"/>
-          <w:sz w:val="24"/>
-          <w:u w:val="none"/>
-        </w:rPr>
-        <w:t xml:space="preserve"> і від тене́т лука́вого во́рога,</w:t>
+          <w:color w:val="000000"/>
+          <w:sz w:val="24"/>
+        </w:rPr>
+        <w:t xml:space="preserve"> і </w:t>
+      </w:r>
+      <w:r>
+        <w:rPr>
+          <w:rFonts w:ascii="Times New Roman" w:hAnsi="Times New Roman"/>
+          <w:color w:val="000000"/>
+          <w:sz w:val="24"/>
+        </w:rPr>
+        <w:t>від</w:t>
+      </w:r>
+      <w:r>
+        <w:rPr>
+          <w:rFonts w:ascii="Times New Roman" w:hAnsi="Times New Roman"/>
+          <w:color w:val="000000"/>
+          <w:sz w:val="24"/>
+        </w:rPr>
+        <w:t xml:space="preserve"> </w:t>
+      </w:r>
+      <w:r>
+        <w:rPr>
+          <w:rFonts w:ascii="Times New Roman" w:hAnsi="Times New Roman"/>
+          <w:color w:val="000000"/>
+          <w:sz w:val="24"/>
+        </w:rPr>
+        <w:t>тене́т</w:t>
+      </w:r>
+      <w:r>
+        <w:rPr>
+          <w:rFonts w:ascii="Times New Roman" w:hAnsi="Times New Roman"/>
+          <w:color w:val="000000"/>
+          <w:sz w:val="24"/>
+        </w:rPr>
+        <w:t xml:space="preserve"> </w:t>
+      </w:r>
+      <w:r>
+        <w:rPr>
+          <w:rFonts w:ascii="Times New Roman" w:hAnsi="Times New Roman"/>
+          <w:color w:val="000000"/>
+          <w:sz w:val="24"/>
+        </w:rPr>
+        <w:t>лука́вого</w:t>
+      </w:r>
+      <w:r>
+        <w:rPr>
+          <w:rFonts w:ascii="Times New Roman" w:hAnsi="Times New Roman"/>
+          <w:color w:val="000000"/>
+          <w:sz w:val="24"/>
+        </w:rPr>
+        <w:t xml:space="preserve"> </w:t>
+      </w:r>
+      <w:r>
+        <w:rPr>
+          <w:rFonts w:ascii="Times New Roman" w:hAnsi="Times New Roman"/>
+          <w:color w:val="000000"/>
+          <w:sz w:val="24"/>
+        </w:rPr>
+        <w:t>во́рога</w:t>
+      </w:r>
+      <w:r>
+        <w:rPr>
+          <w:rFonts w:ascii="Times New Roman" w:hAnsi="Times New Roman"/>
+          <w:color w:val="000000"/>
+          <w:sz w:val="24"/>
+        </w:rPr>
+        <w:t>,</w:t>
       </w:r>
       <w:r>
         <w:rPr>
@@ -3529,13 +5343,34 @@
       <w:r>
         <w:rPr>
           <w:rFonts w:ascii="Times New Roman" w:hAnsi="Times New Roman"/>
-          <w:b w:val="0"/>
-          <w:i w:val="0"/>
-          <w:color w:val="000000"/>
-          <w:sz w:val="24"/>
-          <w:u w:val="none"/>
-        </w:rPr>
-        <w:t xml:space="preserve"> і сподо́би причасти́тися</w:t>
+          <w:color w:val="000000"/>
+          <w:sz w:val="24"/>
+        </w:rPr>
+        <w:t xml:space="preserve"> і </w:t>
+      </w:r>
+      <w:r>
+        <w:rPr>
+          <w:rFonts w:ascii="Times New Roman" w:hAnsi="Times New Roman"/>
+          <w:color w:val="000000"/>
+          <w:sz w:val="24"/>
+        </w:rPr>
+        <w:t>сподо́би</w:t>
+      </w:r>
+      <w:r>
+        <w:rPr>
+          <w:rFonts w:ascii="Times New Roman" w:hAnsi="Times New Roman"/>
+          <w:color w:val="000000"/>
+          <w:sz w:val="24"/>
+        </w:rPr>
+        <w:t xml:space="preserve"> </w:t>
+      </w:r>
+      <w:r>
+        <w:rPr>
+          <w:rFonts w:ascii="Times New Roman" w:hAnsi="Times New Roman"/>
+          <w:color w:val="000000"/>
+          <w:sz w:val="24"/>
+        </w:rPr>
+        <w:t>причасти́тися</w:t>
       </w:r>
       <w:r>
         <w:rPr>
@@ -3547,13 +5382,34 @@
       <w:r>
         <w:rPr>
           <w:rFonts w:ascii="Times New Roman" w:hAnsi="Times New Roman"/>
-          <w:b w:val="0"/>
-          <w:i w:val="0"/>
-          <w:color w:val="000000"/>
-          <w:sz w:val="24"/>
-          <w:u w:val="none"/>
-        </w:rPr>
-        <w:t xml:space="preserve"> ся́йва о́браних</w:t>
+          <w:color w:val="000000"/>
+          <w:sz w:val="24"/>
+        </w:rPr>
+        <w:t xml:space="preserve"> </w:t>
+      </w:r>
+      <w:r>
+        <w:rPr>
+          <w:rFonts w:ascii="Times New Roman" w:hAnsi="Times New Roman"/>
+          <w:color w:val="000000"/>
+          <w:sz w:val="24"/>
+        </w:rPr>
+        <w:t>ся́йва</w:t>
+      </w:r>
+      <w:r>
+        <w:rPr>
+          <w:rFonts w:ascii="Times New Roman" w:hAnsi="Times New Roman"/>
+          <w:color w:val="000000"/>
+          <w:sz w:val="24"/>
+        </w:rPr>
+        <w:t xml:space="preserve"> </w:t>
+      </w:r>
+      <w:r>
+        <w:rPr>
+          <w:rFonts w:ascii="Times New Roman" w:hAnsi="Times New Roman"/>
+          <w:color w:val="000000"/>
+          <w:sz w:val="24"/>
+        </w:rPr>
+        <w:t>о́браних</w:t>
       </w:r>
       <w:r>
         <w:rPr>
@@ -3565,13 +5421,106 @@
       <w:r>
         <w:rPr>
           <w:rFonts w:ascii="Times New Roman" w:hAnsi="Times New Roman"/>
-          <w:b w:val="0"/>
-          <w:i w:val="0"/>
-          <w:color w:val="000000"/>
-          <w:sz w:val="24"/>
-          <w:u w:val="none"/>
-        </w:rPr>
-        <w:t xml:space="preserve"> усі́х, хто Тебе́ сла́вить і поклоня́ється Тобі́!</w:t>
+          <w:color w:val="000000"/>
+          <w:sz w:val="24"/>
+        </w:rPr>
+        <w:t xml:space="preserve"> </w:t>
+      </w:r>
+      <w:r>
+        <w:rPr>
+          <w:rFonts w:ascii="Times New Roman" w:hAnsi="Times New Roman"/>
+          <w:color w:val="000000"/>
+          <w:sz w:val="24"/>
+        </w:rPr>
+        <w:t>усі́х</w:t>
+      </w:r>
+      <w:r>
+        <w:rPr>
+          <w:rFonts w:ascii="Times New Roman" w:hAnsi="Times New Roman"/>
+          <w:color w:val="000000"/>
+          <w:sz w:val="24"/>
+        </w:rPr>
+        <w:t xml:space="preserve">, </w:t>
+      </w:r>
+      <w:r>
+        <w:rPr>
+          <w:rFonts w:ascii="Times New Roman" w:hAnsi="Times New Roman"/>
+          <w:color w:val="000000"/>
+          <w:sz w:val="24"/>
+        </w:rPr>
+        <w:t>хто</w:t>
+      </w:r>
+      <w:r>
+        <w:rPr>
+          <w:rFonts w:ascii="Times New Roman" w:hAnsi="Times New Roman"/>
+          <w:color w:val="000000"/>
+          <w:sz w:val="24"/>
+        </w:rPr>
+        <w:t xml:space="preserve"> </w:t>
+      </w:r>
+      <w:r>
+        <w:rPr>
+          <w:rFonts w:ascii="Times New Roman" w:hAnsi="Times New Roman"/>
+          <w:color w:val="000000"/>
+          <w:sz w:val="24"/>
+        </w:rPr>
+        <w:t>Тебе</w:t>
+      </w:r>
+      <w:r>
+        <w:rPr>
+          <w:rFonts w:ascii="Times New Roman" w:hAnsi="Times New Roman"/>
+          <w:color w:val="000000"/>
+          <w:sz w:val="24"/>
+        </w:rPr>
+        <w:t xml:space="preserve">́ </w:t>
+      </w:r>
+      <w:r>
+        <w:rPr>
+          <w:rFonts w:ascii="Times New Roman" w:hAnsi="Times New Roman"/>
+          <w:color w:val="000000"/>
+          <w:sz w:val="24"/>
+        </w:rPr>
+        <w:t>сла́вить</w:t>
+      </w:r>
+      <w:r>
+        <w:rPr>
+          <w:rFonts w:ascii="Times New Roman" w:hAnsi="Times New Roman"/>
+          <w:color w:val="000000"/>
+          <w:sz w:val="24"/>
+        </w:rPr>
+        <w:t xml:space="preserve"> і </w:t>
+      </w:r>
+      <w:r>
+        <w:rPr>
+          <w:rFonts w:ascii="Times New Roman" w:hAnsi="Times New Roman"/>
+          <w:color w:val="000000"/>
+          <w:sz w:val="24"/>
+        </w:rPr>
+        <w:t>поклоня́ється</w:t>
+      </w:r>
+      <w:r>
+        <w:rPr>
+          <w:rFonts w:ascii="Times New Roman" w:hAnsi="Times New Roman"/>
+          <w:color w:val="000000"/>
+          <w:sz w:val="24"/>
+        </w:rPr>
+        <w:t xml:space="preserve"> </w:t>
+      </w:r>
+      <w:r>
+        <w:rPr>
+          <w:rFonts w:ascii="Times New Roman" w:hAnsi="Times New Roman"/>
+          <w:color w:val="000000"/>
+          <w:sz w:val="24"/>
+        </w:rPr>
+        <w:t>Тобі</w:t>
+      </w:r>
+      <w:r>
+        <w:rPr>
+          <w:rFonts w:ascii="Times New Roman" w:hAnsi="Times New Roman"/>
+          <w:color w:val="000000"/>
+          <w:sz w:val="24"/>
+        </w:rPr>
+        <w:t>́!</w:t>
       </w:r>
     </w:p>
     <w:p>
@@ -5259,16 +7208,6 @@
         <w:rPr>
           <w:rFonts w:ascii="Times New Roman" w:hAnsi="Times New Roman"/>
           <w:b w:val="0"/>
-          <w:i/>
-          <w:color w:val="FF4400"/>
-          <w:sz w:val="24"/>
-        </w:rPr>
-        <w:t xml:space="preserve">(г. 4): </w:t>
-      </w:r>
-      <w:r>
-        <w:rPr>
-          <w:rFonts w:ascii="Times New Roman" w:hAnsi="Times New Roman"/>
-          <w:b w:val="0"/>
           <w:i w:val="0"/>
           <w:color w:val="000000"/>
           <w:sz w:val="24"/>
@@ -5539,7 +7478,23 @@
           <w:sz w:val="24"/>
           <w:u w:val="single"/>
         </w:rPr>
-        <w:t>[Господи, Боже наш! Згадай нас грішних і недостойних слуг Твоїх, коли призиваємо святе ім'я Твоє, і не осороми нас, коли очікуємо милости Твоєї, але вислухай, Господи, усі наші спасенні прохання, і вчини нас достойними любити і боятися Тебе від усього серця нашого і творити в усьому волю Твою.]</w:t>
+        <w:t>[</w:t>
+      </w:r>
+      <w:r>
+        <w:rPr>
+          <w:rFonts w:ascii="Times New Roman" w:hAnsi="Times New Roman"/>
+          <w:sz w:val="24"/>
+          <w:u w:val="single"/>
+        </w:rPr>
+        <w:t>Господи, Боже наш! Згадай нас грішних і недостойних слуг Твоїх, коли призиваємо святе ім'я Твоє, і не осороми нас, коли очікуємо милости Твоєї, але вислухай, Господи, усі наші спасенні прохання, і вчини нас достойними любити і боятися Тебе від усього серця нашого і творити в усьому волю Твою</w:t>
+      </w:r>
+      <w:r>
+        <w:rPr>
+          <w:rFonts w:ascii="Times New Roman" w:hAnsi="Times New Roman"/>
+          <w:sz w:val="24"/>
+          <w:u w:val="single"/>
+        </w:rPr>
+        <w:t>.]</w:t>
       </w:r>
     </w:p>
     <w:p>
@@ -7529,7 +9484,7 @@
           <w:color w:val="FF0000"/>
           <w:sz w:val="24"/>
         </w:rPr>
-        <w:t>Під час рецитування псалмів, священник читає потиху перед св. дверми оці молитви:</w:t>
+        <w:t>Під час рецитування псалмів, Священник читає потиху перед св. дверми оці молитви:</w:t>
       </w:r>
     </w:p>
     <w:p>
@@ -7906,7 +9861,7 @@
           <w:color w:val="000000"/>
           <w:sz w:val="24"/>
         </w:rPr>
-        <w:t xml:space="preserve"> Боже, Боже наш! Ти сотворив розумні й духовні сили Своєю волею. Тебе просимо й Тобі молимося: Прийми наші посильні величання з усіма Твоїми творіннями і збагати щедрими даруваннями Твоєї ласки. Бо перед Тобою згинається всяке коліно: на небі, на землі й під землею, і все, що живе, і все створіння оспівує неосяжну Твою славу, бо Ти Бог правдивий і вельми милостивий. Тебе бо хвалять усі небесні сили, і Тобі славу возсилаємо: Отцю, і Сину, і Святому Духові, нині і повсякчас, і на віки віків. Амінь.</w:t>
+        <w:t xml:space="preserve"> Боже, Боже наш! Ти сотворив розумні й духовні сили своєю волею. Тебе просимо й Тобі молимося: Прийми наші посильні величання з усіма Твоїми творіннями і збагати щедрими даруваннями Твоєї ласки. Бо перед Тобою згинається всяке коліно: на небі, на землі й під землею, і все, що живе, і все створіння оспівує неосяжну Твою славу, бо Ти Бог правдивий і вельми милостивий. Тебе бо хвалять усі небесні сили, і Тобі славу возсилаємо: Отцю, і Сину, і Святому Духові, нині і повсякчас, і на віки віків. Амінь.</w:t>
       </w:r>
     </w:p>
     <w:p>
@@ -8852,21 +10807,11 @@
         <w:rPr>
           <w:rFonts w:ascii="Times New Roman" w:hAnsi="Times New Roman"/>
           <w:b w:val="0"/>
-          <w:i/>
-          <w:color w:val="FF4400"/>
-          <w:sz w:val="24"/>
-        </w:rPr>
-        <w:t xml:space="preserve">(г. 4): </w:t>
-      </w:r>
-      <w:r>
-        <w:rPr>
-          <w:rFonts w:ascii="Times New Roman" w:hAnsi="Times New Roman"/>
-          <w:b w:val="0"/>
           <w:i w:val="0"/>
           <w:color w:val="000000"/>
           <w:sz w:val="24"/>
         </w:rPr>
-        <w:t>Ти вища від усіх створінь, Богородице,* тож, не вміючи достойно тебе оспівувати,* молимось: Ласкаво помилуй нас!</w:t>
+        <w:t>Богородице Діво, єдина чиста і єдина благословенна!* Ми пізнали Слово Отця, Хрисга Бога нашого,* що з тебе воплотився,* тому безупинно тебе, оспівуючи, величаємо.</w:t>
       </w:r>
     </w:p>
     <w:p>
@@ -9101,7 +11046,7 @@
           <w:rFonts w:ascii="Times New Roman" w:hAnsi="Times New Roman"/>
           <w:sz w:val="24"/>
         </w:rPr>
-        <w:t xml:space="preserve"> Несказанним людинолюб'ям твоїм, Христе Боже,* зробив ти рибалок мудрішими від риторів* і послав проповідниками по всій землі.* Заради них утверди твою Церкву* і вірним дай благословення твоє,* єдиний, що у святих спочиваєш.</w:t>
+        <w:t xml:space="preserve"> Несказанним чоловіколюб'ям твоїм, Христе Боже,* зробив ти рибалок мудрішими від риторів* і послав проповідниками по всій землі.* Заради них утверди твою Церкву* і вірним дай благословення твоє,* єдиний, що у святих спочиваєш.</w:t>
       </w:r>
     </w:p>
     <w:p>
@@ -9278,15 +11223,7 @@
           <w:sz w:val="24"/>
           <w:u w:val="single"/>
         </w:rPr>
-        <w:t xml:space="preserve">[Боже й Отче Господа нашого Ісуса Христа! Ти підніс нас з постелі нашої і зібрав на годину молитви. Дай нам ласку відкрити уста наші і прийми наші подяки, що в наших силах, і навчи нас установ Твоїх. Бо молитися як слід не вміємо, якщо Ти, Господи, святим Твоїм Духом </w:t>
-      </w:r>
-      <w:r>
-        <w:rPr>
-          <w:rFonts w:ascii="Times New Roman" w:hAnsi="Times New Roman"/>
-          <w:sz w:val="24"/>
-          <w:u w:val="single"/>
-        </w:rPr>
-        <w:t>не навчиш нас. Тому молимося Тобі: Даруй і прости, якщо ми згрішили аж до теперішньої години словом або ділом, або думкою, добровільно або недобровільно. Бо коли на провини будеш дивитися, Господи, Господи, то хто встоїться, бо в Тебе є прощення. Ти один святий, допоміжник сильний, захисник життя нашого, і Тебе ми завжди оспівуватимемо.]</w:t>
+        <w:t>[Боже й Отче Господа нашого Ісуса Христа! Ти підніс нас з постелі нашої і зібрав на годину молитви. Дай нам ласку відкрити уста наші і прийми наші подяки, що в наших силах, і навчи нас установ Твоїх. Бо молитися як слід не вміємо, якщо Ти, Господи, святим Твоїм Духом не навчиш нас. Тому молимося Тобі: Даруй і прости, якщо ми згрішили аж до теперішньої години словом або ділом, або думкою, добровільно або недобровільно. Бо коли на провини будеш дивитися, Господи, Господи, то хто встоїться, бо в Тебе є прощення. Ти один святий, допоміжник сильний, захисник життя нашого, і Тебе ми завжди оспівуватимемо.]</w:t>
       </w:r>
     </w:p>
     <w:p>
@@ -9381,7 +11318,7 @@
           <w:rFonts w:ascii="Times New Roman" w:hAnsi="Times New Roman"/>
           <w:sz w:val="24"/>
         </w:rPr>
-        <w:t xml:space="preserve"> Рибалки, уловивши народи сіткою Духа,* навчили всі сторони світу* поклонятися тобі з Отцем і Духом, Христе Боже.* Заради них Церкву твою укріпи* і вірним пошли твоє благословення,* єдиний Милостивий і Людинолюбче.</w:t>
+        <w:t xml:space="preserve"> Рибалки, уловивши народи сіткою Духа,* навчили всі сторони світу* поклонятися тобі з Отцем і Духом, Христе Боже.* Заради них Церкву твою укріпи* і вірним пошли твоє благословення,* єдиний Милостивий і Чоловіколюбче.</w:t>
       </w:r>
     </w:p>
     <w:p>
@@ -10239,6 +12176,7 @@
     </w:p>
     <w:p>
       <w:pPr>
+        <w:pStyle w:val="a"/>
         <w:spacing w:after="120"/>
       </w:pPr>
       <w:r>
@@ -10252,113 +12190,8 @@
     </w:p>
     <w:p>
       <w:pPr>
-        <w:spacing w:after="120"/>
-      </w:pPr>
-      <w:r>
-        <w:rPr>
-          <w:rFonts w:ascii="Times New Roman" w:hAnsi="Times New Roman"/>
-          <w:i/>
-          <w:color w:val="FF4400"/>
-          <w:sz w:val="24"/>
-        </w:rPr>
-        <w:t>Вірні:</w:t>
-      </w:r>
-      <w:r>
-        <w:rPr>
-          <w:rFonts w:ascii="Times New Roman" w:hAnsi="Times New Roman"/>
-          <w:color w:val="000000"/>
-          <w:sz w:val="24"/>
-        </w:rPr>
-        <w:t xml:space="preserve"> Го́споди, поми́луй.</w:t>
-      </w:r>
-    </w:p>
-    <w:p>
-      <w:pPr>
-        <w:spacing w:after="120"/>
-      </w:pPr>
-      <w:r>
-        <w:rPr>
-          <w:rFonts w:ascii="Times New Roman" w:hAnsi="Times New Roman"/>
-          <w:sz w:val="24"/>
-        </w:rPr>
-        <w:t>Заступи, спаси, помилуй і охорони нас, Боже, Твоєю благодаттю</w:t>
-      </w:r>
-    </w:p>
-    <w:p>
-      <w:pPr>
-        <w:spacing w:after="120"/>
-      </w:pPr>
-      <w:r>
-        <w:rPr>
-          <w:rFonts w:ascii="Times New Roman" w:hAnsi="Times New Roman"/>
-          <w:i/>
-          <w:color w:val="FF4400"/>
-          <w:sz w:val="24"/>
-        </w:rPr>
-        <w:t>Вірні:</w:t>
-      </w:r>
-      <w:r>
-        <w:rPr>
-          <w:rFonts w:ascii="Times New Roman" w:hAnsi="Times New Roman"/>
-          <w:color w:val="000000"/>
-          <w:sz w:val="24"/>
-        </w:rPr>
-        <w:t xml:space="preserve"> Го́споди, поми́луй.</w:t>
-      </w:r>
-    </w:p>
-    <w:p>
-      <w:pPr>
-        <w:spacing w:after="120"/>
-      </w:pPr>
-      <w:r>
-        <w:rPr>
-          <w:rFonts w:ascii="Times New Roman" w:hAnsi="Times New Roman"/>
-          <w:color w:val="000000"/>
-          <w:sz w:val="24"/>
-        </w:rPr>
-        <w:t>Пресвяту, пречисту, преблагословенну, славну Владичицю нашу Богородицю і приснодіву Марію, з усіма святими пом’янувши, самих себе, і один одного, і все життя наше Христу Богові віддаймо.</w:t>
-      </w:r>
-    </w:p>
-    <w:p>
-      <w:pPr>
-        <w:spacing w:after="120"/>
-      </w:pPr>
-      <w:r>
-        <w:rPr>
-          <w:rFonts w:ascii="Times New Roman" w:hAnsi="Times New Roman"/>
-          <w:i/>
-          <w:color w:val="FF4400"/>
-          <w:sz w:val="24"/>
-        </w:rPr>
-        <w:t>Вірні:</w:t>
-      </w:r>
-      <w:r>
-        <w:rPr>
-          <w:rFonts w:ascii="Times New Roman" w:hAnsi="Times New Roman"/>
-          <w:color w:val="000000"/>
-          <w:sz w:val="24"/>
-        </w:rPr>
-        <w:t xml:space="preserve"> Тобі́, Го́споди.</w:t>
-      </w:r>
-    </w:p>
-    <w:p>
-      <w:pPr>
-        <w:spacing w:after="120"/>
-        <w:jc w:val="both"/>
-      </w:pPr>
-      <w:r>
-        <w:rPr>
-          <w:rFonts w:ascii="Times New Roman" w:hAnsi="Times New Roman"/>
-          <w:sz w:val="24"/>
-          <w:u w:val="single"/>
-        </w:rPr>
-        <w:t>[Господи, Боже наш, що сонну неміч забрав від нас і покликав нас візванням святим, щоб і вночі підносити руки наші і прославляти Тебе за справедливі Твої присуди. Прийми благання наші, моління, визнавання, нічні служби і даруй нам, Боже, віру бездоганну, надію впевнену, любов нелицемірну. Благослови наші входи й виходи, вчинки, слова, діла й думки; і дай нам дочекатися початку дня, нам, що хвалять й оспівують, і благословлять добрість Твоєї несказанної сили]</w:t>
-      </w:r>
-    </w:p>
-    <w:p>
-      <w:pPr>
-        <w:spacing w:after="120"/>
-        <w:jc w:val="both"/>
+        <w:pStyle w:val="a"/>
+        <w:spacing w:after="120"/>
       </w:pPr>
       <w:r>
         <w:rPr>
@@ -10367,7 +12200,127 @@
           <w:color w:val="FF0000"/>
           <w:sz w:val="24"/>
         </w:rPr>
-        <w:t xml:space="preserve">Священник: </w:t>
+        <w:t>Вірні:</w:t>
+      </w:r>
+      <w:r>
+        <w:rPr>
+          <w:rFonts w:ascii="Times New Roman" w:hAnsi="Times New Roman"/>
+          <w:color w:val="000000"/>
+          <w:sz w:val="24"/>
+        </w:rPr>
+        <w:t xml:space="preserve"> Господи, помилуй.</w:t>
+      </w:r>
+    </w:p>
+    <w:p>
+      <w:pPr>
+        <w:pStyle w:val="a"/>
+        <w:spacing w:after="120"/>
+      </w:pPr>
+      <w:r>
+        <w:rPr>
+          <w:rFonts w:ascii="Times New Roman" w:hAnsi="Times New Roman"/>
+          <w:color w:val="000000"/>
+          <w:sz w:val="24"/>
+        </w:rPr>
+        <w:t>Заступи, спаси, помилуй і охорони нас, Боже, твоєю благодаттю.</w:t>
+      </w:r>
+    </w:p>
+    <w:p>
+      <w:pPr>
+        <w:pStyle w:val="a"/>
+        <w:spacing w:after="120"/>
+      </w:pPr>
+      <w:r>
+        <w:rPr>
+          <w:rFonts w:ascii="Times New Roman" w:hAnsi="Times New Roman"/>
+          <w:i/>
+          <w:color w:val="FF0000"/>
+          <w:sz w:val="24"/>
+        </w:rPr>
+        <w:t>Вірні:</w:t>
+      </w:r>
+      <w:r>
+        <w:rPr>
+          <w:rFonts w:ascii="Times New Roman" w:hAnsi="Times New Roman"/>
+          <w:color w:val="000000"/>
+          <w:sz w:val="24"/>
+        </w:rPr>
+        <w:t xml:space="preserve"> Господи, помилуй.</w:t>
+      </w:r>
+    </w:p>
+    <w:p>
+      <w:pPr>
+        <w:pStyle w:val="a"/>
+        <w:spacing w:after="120"/>
+      </w:pPr>
+      <w:r>
+        <w:rPr>
+          <w:rFonts w:ascii="Times New Roman" w:hAnsi="Times New Roman"/>
+          <w:color w:val="000000"/>
+          <w:sz w:val="24"/>
+        </w:rPr>
+        <w:t>Пресвяту, пречисту, преблагословенну, славну Владичицю нашу Богородицю і приснодіву Марію, з усіма святими пом'янувши, самі себе, і один одного, і все життя наше Христу Богові віддаймо.</w:t>
+      </w:r>
+    </w:p>
+    <w:p>
+      <w:pPr>
+        <w:pStyle w:val="a"/>
+        <w:spacing w:after="120"/>
+      </w:pPr>
+      <w:r>
+        <w:rPr>
+          <w:rFonts w:ascii="Times New Roman" w:hAnsi="Times New Roman"/>
+          <w:i/>
+          <w:color w:val="FF0000"/>
+          <w:sz w:val="24"/>
+        </w:rPr>
+        <w:t>Вірні:</w:t>
+      </w:r>
+      <w:r>
+        <w:rPr>
+          <w:rFonts w:ascii="Times New Roman" w:hAnsi="Times New Roman"/>
+          <w:color w:val="000000"/>
+          <w:sz w:val="24"/>
+        </w:rPr>
+        <w:t xml:space="preserve"> Тобі, Господи.</w:t>
+      </w:r>
+    </w:p>
+    <w:p>
+      <w:pPr>
+        <w:pStyle w:val="a"/>
+        <w:spacing w:after="120"/>
+      </w:pPr>
+      <w:r>
+        <w:rPr>
+          <w:rFonts w:ascii="Times New Roman" w:hAnsi="Times New Roman"/>
+          <w:sz w:val="24"/>
+          <w:u w:val="single"/>
+        </w:rPr>
+        <w:t>[Господи, Боже наш, що сонну неміч забрав від нас і покликав нас візванням святим, щоб і вночі підносити руки наші і прославляти тебе за справедливі твої присуди. Прийми благання наші, моління, визнавання, нічні служби і даруй нам, Боже, віру бездоганну, надію впевнену, любов нелицемірну. Благослови наші входи й виходи, вчинки, слова, діла й думки; і дай нам дочекатися початку дня, нам, що хвалять й оспівують, і благословлять добрість твоєї несказанної сили]</w:t>
+      </w:r>
+    </w:p>
+    <w:p>
+      <w:pPr>
+        <w:pStyle w:val="a"/>
+        <w:spacing w:after="120"/>
+      </w:pPr>
+      <w:r>
+        <w:rPr>
+          <w:rFonts w:ascii="Times New Roman" w:hAnsi="Times New Roman"/>
+          <w:i/>
+          <w:color w:val="FF0000"/>
+          <w:sz w:val="24"/>
+        </w:rPr>
+        <w:t>Священик:</w:t>
+      </w:r>
+      <w:r>
+        <w:rPr>
+          <w:rFonts w:ascii="Times New Roman" w:hAnsi="Times New Roman"/>
+          <w:i/>
+          <w:color w:val="FF0000"/>
+          <w:sz w:val="24"/>
+        </w:rPr>
+        <w:t xml:space="preserve"> </w:t>
       </w:r>
       <w:r>
         <w:rPr>
@@ -10382,7 +12335,7 @@
           <w:rFonts w:ascii="Times New Roman" w:hAnsi="Times New Roman"/>
           <w:sz w:val="24"/>
         </w:rPr>
-        <w:t>, нині, і повсякчас, і на віки віків.</w:t>
+        <w:t>, нині і повсякчас, і на віки віків.</w:t>
       </w:r>
     </w:p>
     <w:p>
@@ -11127,6 +13080,7 @@
     </w:p>
     <w:p>
       <w:pPr>
+        <w:pStyle w:val="a"/>
         <w:spacing w:after="120"/>
       </w:pPr>
       <w:r>
@@ -11140,121 +13094,8 @@
     </w:p>
     <w:p>
       <w:pPr>
-        <w:spacing w:after="120"/>
-      </w:pPr>
-      <w:r>
-        <w:rPr>
-          <w:rFonts w:ascii="Times New Roman" w:hAnsi="Times New Roman"/>
-          <w:i/>
-          <w:color w:val="FF4400"/>
-          <w:sz w:val="24"/>
-        </w:rPr>
-        <w:t>Вірні:</w:t>
-      </w:r>
-      <w:r>
-        <w:rPr>
-          <w:rFonts w:ascii="Times New Roman" w:hAnsi="Times New Roman"/>
-          <w:color w:val="000000"/>
-          <w:sz w:val="24"/>
-        </w:rPr>
-        <w:t xml:space="preserve"> Го́споди, поми́луй.</w:t>
-      </w:r>
-    </w:p>
-    <w:p>
-      <w:pPr>
-        <w:spacing w:after="120"/>
-      </w:pPr>
-      <w:r>
-        <w:rPr>
-          <w:rFonts w:ascii="Times New Roman" w:hAnsi="Times New Roman"/>
-          <w:sz w:val="24"/>
-        </w:rPr>
-        <w:t>Заступи, спаси, помилуй і охорони нас, Боже, Твоєю благодаттю</w:t>
-      </w:r>
-    </w:p>
-    <w:p>
-      <w:pPr>
-        <w:spacing w:after="120"/>
-      </w:pPr>
-      <w:r>
-        <w:rPr>
-          <w:rFonts w:ascii="Times New Roman" w:hAnsi="Times New Roman"/>
-          <w:i/>
-          <w:color w:val="FF4400"/>
-          <w:sz w:val="24"/>
-        </w:rPr>
-        <w:t>Вірні:</w:t>
-      </w:r>
-      <w:r>
-        <w:rPr>
-          <w:rFonts w:ascii="Times New Roman" w:hAnsi="Times New Roman"/>
-          <w:color w:val="000000"/>
-          <w:sz w:val="24"/>
-        </w:rPr>
-        <w:t xml:space="preserve"> Го́споди, поми́луй.</w:t>
-      </w:r>
-    </w:p>
-    <w:p>
-      <w:pPr>
-        <w:spacing w:after="120"/>
-      </w:pPr>
-      <w:r>
-        <w:rPr>
-          <w:rFonts w:ascii="Times New Roman" w:hAnsi="Times New Roman"/>
-          <w:color w:val="000000"/>
-          <w:sz w:val="24"/>
-        </w:rPr>
-        <w:t>Пресвяту, пречисту, преблагословенну, славну Владичицю нашу Богородицю і приснодіву Марію, з усіма святими пом’янувши, самих себе, і один одного, і все життя наше Христу Богові віддаймо.</w:t>
-      </w:r>
-    </w:p>
-    <w:p>
-      <w:pPr>
-        <w:spacing w:after="120"/>
-      </w:pPr>
-      <w:r>
-        <w:rPr>
-          <w:rFonts w:ascii="Times New Roman" w:hAnsi="Times New Roman"/>
-          <w:i/>
-          <w:color w:val="FF4400"/>
-          <w:sz w:val="24"/>
-        </w:rPr>
-        <w:t>Вірні:</w:t>
-      </w:r>
-      <w:r>
-        <w:rPr>
-          <w:rFonts w:ascii="Times New Roman" w:hAnsi="Times New Roman"/>
-          <w:color w:val="000000"/>
-          <w:sz w:val="24"/>
-        </w:rPr>
-        <w:t xml:space="preserve"> Тобі́, Го́споди.</w:t>
-      </w:r>
-    </w:p>
-    <w:p>
-      <w:pPr>
-        <w:spacing w:after="120"/>
-        <w:jc w:val="both"/>
-      </w:pPr>
-      <w:r>
-        <w:rPr>
-          <w:rFonts w:ascii="Times New Roman" w:hAnsi="Times New Roman"/>
-          <w:sz w:val="24"/>
-          <w:u w:val="single"/>
-        </w:rPr>
-        <w:t xml:space="preserve">[Благодаримо Тебе, Господи, Боже спасіння нашого, бо Ти все робиш для добра життя нашого, щоб ми завжди на Тебе споглядали, Спасителю й Доброчинцю душ наших. Бо Ти дав спокій нам у час минулої ночі й підвів нас, щоб ми поклонялися величному імені Твоєму. Тому молимо Тебе, Господи: Дай нам ласку й силу, щоб ми стали гідними співати </w:t>
-      </w:r>
-      <w:r>
-        <w:rPr>
-          <w:rFonts w:ascii="Times New Roman" w:hAnsi="Times New Roman"/>
-          <w:sz w:val="24"/>
-          <w:u w:val="single"/>
-        </w:rPr>
-        <w:t>Тобі розумно й молитися безупинно та в страсі і тремтінні над нашим спасінням працювали, при заступництві Христа Твого. Пом'яни, Господи, і тих, що вночі до Тебе кличуть. Вислухай їх і помилуй, і круши під ноги їх невидимих і войовничих ворогів.]</w:t>
-      </w:r>
-    </w:p>
-    <w:p>
-      <w:pPr>
-        <w:spacing w:after="120"/>
-        <w:jc w:val="both"/>
+        <w:pStyle w:val="a"/>
+        <w:spacing w:after="120"/>
       </w:pPr>
       <w:r>
         <w:rPr>
@@ -11263,22 +13104,142 @@
           <w:color w:val="FF0000"/>
           <w:sz w:val="24"/>
         </w:rPr>
-        <w:t xml:space="preserve">Священник: </w:t>
-      </w:r>
-      <w:r>
-        <w:rPr>
-          <w:rFonts w:ascii="Times New Roman" w:hAnsi="Times New Roman"/>
-          <w:color w:val="000000"/>
-          <w:sz w:val="24"/>
-        </w:rPr>
-        <w:t>Бо Ти цар миру і Спас душ наших – і Тобі славу возсилаємо, Отцю, і Сину, і Святому Духові</w:t>
-      </w:r>
-      <w:r>
-        <w:rPr>
-          <w:rFonts w:ascii="Times New Roman" w:hAnsi="Times New Roman"/>
-          <w:sz w:val="24"/>
-        </w:rPr>
-        <w:t>, нині, і повсякчас, і на віки віків.</w:t>
+        <w:t>Вірні:</w:t>
+      </w:r>
+      <w:r>
+        <w:rPr>
+          <w:rFonts w:ascii="Times New Roman" w:hAnsi="Times New Roman"/>
+          <w:color w:val="000000"/>
+          <w:sz w:val="24"/>
+        </w:rPr>
+        <w:t xml:space="preserve"> Господи, помилуй.</w:t>
+      </w:r>
+    </w:p>
+    <w:p>
+      <w:pPr>
+        <w:pStyle w:val="a"/>
+        <w:spacing w:after="120"/>
+      </w:pPr>
+      <w:r>
+        <w:rPr>
+          <w:rFonts w:ascii="Times New Roman" w:hAnsi="Times New Roman"/>
+          <w:color w:val="000000"/>
+          <w:sz w:val="24"/>
+        </w:rPr>
+        <w:t>Заступи, спаси, помилуй і охорони нас, Боже, твоєю благодаттю.</w:t>
+      </w:r>
+    </w:p>
+    <w:p>
+      <w:pPr>
+        <w:pStyle w:val="a"/>
+        <w:spacing w:after="120"/>
+      </w:pPr>
+      <w:r>
+        <w:rPr>
+          <w:rFonts w:ascii="Times New Roman" w:hAnsi="Times New Roman"/>
+          <w:i/>
+          <w:color w:val="FF0000"/>
+          <w:sz w:val="24"/>
+        </w:rPr>
+        <w:t>Вірні:</w:t>
+      </w:r>
+      <w:r>
+        <w:rPr>
+          <w:rFonts w:ascii="Times New Roman" w:hAnsi="Times New Roman"/>
+          <w:color w:val="000000"/>
+          <w:sz w:val="24"/>
+        </w:rPr>
+        <w:t xml:space="preserve"> Господи, помилуй.</w:t>
+      </w:r>
+    </w:p>
+    <w:p>
+      <w:pPr>
+        <w:pStyle w:val="a"/>
+        <w:spacing w:after="120"/>
+      </w:pPr>
+      <w:r>
+        <w:rPr>
+          <w:rFonts w:ascii="Times New Roman" w:hAnsi="Times New Roman"/>
+          <w:color w:val="000000"/>
+          <w:sz w:val="24"/>
+        </w:rPr>
+        <w:t>Пресвяту, пречисту, преблагословенну, славну Владичицю нашу Богородицю і приснодіву Марію, з усіма святими пом'янувши, самі себе, і один одного, і все життя наше Христу Богові віддаймо.</w:t>
+      </w:r>
+    </w:p>
+    <w:p>
+      <w:pPr>
+        <w:pStyle w:val="a"/>
+        <w:spacing w:after="120"/>
+      </w:pPr>
+      <w:r>
+        <w:rPr>
+          <w:rFonts w:ascii="Times New Roman" w:hAnsi="Times New Roman"/>
+          <w:i/>
+          <w:color w:val="FF0000"/>
+          <w:sz w:val="24"/>
+        </w:rPr>
+        <w:t>Вірні:</w:t>
+      </w:r>
+      <w:r>
+        <w:rPr>
+          <w:rFonts w:ascii="Times New Roman" w:hAnsi="Times New Roman"/>
+          <w:color w:val="000000"/>
+          <w:sz w:val="24"/>
+        </w:rPr>
+        <w:t xml:space="preserve"> Тобі, Господи.</w:t>
+      </w:r>
+    </w:p>
+    <w:p>
+      <w:pPr>
+        <w:pStyle w:val="a"/>
+        <w:spacing w:after="120"/>
+      </w:pPr>
+      <w:r>
+        <w:rPr>
+          <w:rFonts w:ascii="Times New Roman" w:hAnsi="Times New Roman"/>
+          <w:sz w:val="24"/>
+          <w:u w:val="single"/>
+        </w:rPr>
+        <w:t>[Дякуємо тобі, Господи, Боже спасіння нашого, бо ти все робиш для добра життя нашого, щоб ми завжди на тебе споглядали, Спасителю й Доброчинцю душ наших. Бо ти дав спокій нам у час минулої ночі й підвів нас, щоб ми поклонялися величному імені твоєму. Тому молимо тебе, Господи: Дай нам ласку й силу, щоб ми стали гідними співати тобі розумно й молитися безупинно та в страсі і тремтінні над нашим спасінням працювали, при заступництві Христа твого. Пом'яни, Господи, і тих, що вночі до тебе кличуть. Вислухай їх і помилуй, і круши під ноги їх невидимих і войовничих ворогів.]</w:t>
+      </w:r>
+    </w:p>
+    <w:p>
+      <w:pPr>
+        <w:pStyle w:val="a"/>
+        <w:spacing w:after="120"/>
+      </w:pPr>
+      <w:r>
+        <w:rPr>
+          <w:rFonts w:ascii="Times New Roman" w:hAnsi="Times New Roman"/>
+          <w:i/>
+          <w:color w:val="FF0000"/>
+          <w:sz w:val="24"/>
+        </w:rPr>
+        <w:t>Священик:</w:t>
+      </w:r>
+      <w:r>
+        <w:rPr>
+          <w:rFonts w:ascii="Times New Roman" w:hAnsi="Times New Roman"/>
+          <w:i/>
+          <w:color w:val="FF0000"/>
+          <w:sz w:val="24"/>
+        </w:rPr>
+        <w:t xml:space="preserve"> </w:t>
+      </w:r>
+      <w:r>
+        <w:rPr>
+          <w:rFonts w:ascii="Times New Roman" w:hAnsi="Times New Roman"/>
+          <w:color w:val="000000"/>
+          <w:sz w:val="24"/>
+        </w:rPr>
+        <w:t>Бо Ти цар миру і Спас душ наших і Тобі славу возсилаємо: Отцю, і Сину, і Святому Духові</w:t>
+      </w:r>
+      <w:r>
+        <w:rPr>
+          <w:rFonts w:ascii="Times New Roman" w:hAnsi="Times New Roman"/>
+          <w:sz w:val="24"/>
+        </w:rPr>
+        <w:t>, нині і повсякчас, і на віки віків.</w:t>
       </w:r>
     </w:p>
     <w:p>
@@ -12336,7 +14297,7 @@
           <w:sz w:val="24"/>
           <w:u w:val="single"/>
         </w:rPr>
-        <w:t>[Боже, Боже наш! Ти сотворив розумні й духовні сили Своєю волею. Тебе просимо й Тобі молимося: Прийми наші посильні величання з усіма Твоїми творіннями і збагати щедрими даруваннями Твоєї ласки. Бо перед Тобою згинається всяке коліно: на небі, на землі й під землею, і все, що живе, і все створіння оспівує неосяжну Твою славу, бо Ти Бог правдивий і вельми милостивий.]</w:t>
+        <w:t>[Боже, Боже наш! Ти сотворив розумні й духовні сили своєю волею. Тебе просимо й Тобі молимося: Прийми наші посильні величання з усіма Твоїми творіннями і збагати щедрими даруваннями Твоєї ласки. Бо перед Тобою згинається всяке коліно: на небі, на землі й під землею, і все, що живе, і все створіння оспівує неосяжну Твою славу, бо Ти Бог правдивий і вельми милостивий.]</w:t>
       </w:r>
     </w:p>
     <w:p>
@@ -13955,7 +15916,7 @@
           <w:rFonts w:ascii="Times New Roman" w:hAnsi="Times New Roman"/>
           <w:sz w:val="24"/>
         </w:rPr>
-        <w:t>Безліч святих твоїх* молить тебе, Христе:* Помилуй і спаси нас, як Людинолюбець.</w:t>
+        <w:t>Безліч святих твоїх* молить тебе, Христе:* Помилуй і спаси нас, як чоловіколюбець.</w:t>
       </w:r>
     </w:p>
     <w:p>
@@ -14236,16 +16197,6 @@
           <w:sz w:val="24"/>
         </w:rPr>
         <w:t xml:space="preserve">Слава, і нині: </w:t>
-      </w:r>
-      <w:r>
-        <w:rPr>
-          <w:rFonts w:ascii="Times New Roman" w:hAnsi="Times New Roman"/>
-          <w:b w:val="0"/>
-          <w:i/>
-          <w:color w:val="FF4400"/>
-          <w:sz w:val="24"/>
-        </w:rPr>
-        <w:t xml:space="preserve">(г. 4): </w:t>
       </w:r>
       <w:r>
         <w:rPr>

</xml_diff>